<commit_message>
PDM I Lecture 9: fold in the 21 September recording
Guide section 9 gains a Professor-emphasized box built from both transcripts
(Notability + faster-whisper, three segments): the two lipid calculations are
examinable (worked in class on slide 43), the LDL-C goal at both ends, the
one-word frame per biomarker, CK only when troponin is unavailable, hs-CRP as
an office-visit lab, the chest-pain case workup, case 3 as screening. A muted
note lists four places the audio departs from the deck (slide wins).
Cram sheet gains five star rows. ALLOW_CALC stays True; the partition
docstring records her words. Partition + render reproduce identical quizzes.

Co-Authored-By: Claude Opus 5.5 (1M context) <noreply@anthropic.com>
</commit_message>
<xml_diff>
--- a/Principles of Diagnostic Medicine I Exam 2/pdm-exam-2-cram-sheet.docx
+++ b/Principles of Diagnostic Medicine I Exam 2/pdm-exam-2-cram-sheet.docx
@@ -401,6 +401,56 @@
                 <w:i w:val="0"/>
                 <w:sz w:val="18"/>
               </w:rPr>
+              <w:t>★ Two calculations ARE examinable</w:t>
+            </w:r>
+          </w:p>
+        </w:tc>
+        <w:tc>
+          <w:tcPr>
+            <w:tcW w:type="dxa" w:w="5112"/>
+          </w:tcPr>
+          <w:p>
+            <w:pPr>
+              <w:spacing w:after="40"/>
+            </w:pPr>
+            <w:r>
+              <w:rPr>
+                <w:sz w:val="18"/>
+              </w:rPr>
+            </w:r>
+            <w:r>
+              <w:rPr>
+                <w:b w:val="0"/>
+                <w:i w:val="0"/>
+                <w:sz w:val="18"/>
+              </w:rPr>
+              <w:t>Friedewald LDL-C and non-HDL-C, worked in class on the Lecture 9 practice slide: “two calculations, and then we have to interpret.” The newer LDL equations are calculator-only.</w:t>
+            </w:r>
+          </w:p>
+        </w:tc>
+      </w:tr>
+      <w:tr>
+        <w:tc>
+          <w:tcPr>
+            <w:tcW w:type="dxa" w:w="5112"/>
+            <w:shd w:val="clear" w:color="auto" w:fill="F1EEEF"/>
+          </w:tcPr>
+          <w:p>
+            <w:pPr>
+              <w:spacing w:after="40"/>
+            </w:pPr>
+            <w:r>
+              <w:rPr>
+                <w:b/>
+                <w:sz w:val="18"/>
+              </w:rPr>
+            </w:r>
+            <w:r>
+              <w:rPr>
+                <w:b/>
+                <w:i w:val="0"/>
+                <w:sz w:val="18"/>
+              </w:rPr>
               <w:t>Not examined (said out loud)</w:t>
             </w:r>
           </w:p>
@@ -4047,6 +4097,56 @@
                 <w:i w:val="0"/>
                 <w:sz w:val="18"/>
               </w:rPr>
+              <w:t>★ One word each</w:t>
+            </w:r>
+          </w:p>
+        </w:tc>
+        <w:tc>
+          <w:tcPr>
+            <w:tcW w:type="dxa" w:w="5112"/>
+          </w:tcPr>
+          <w:p>
+            <w:pPr>
+              <w:spacing w:after="40"/>
+            </w:pPr>
+            <w:r>
+              <w:rPr>
+                <w:sz w:val="18"/>
+              </w:rPr>
+            </w:r>
+            <w:r>
+              <w:rPr>
+                <w:b w:val="0"/>
+                <w:i w:val="0"/>
+                <w:sz w:val="18"/>
+              </w:rPr>
+              <w:t>CRP = INFLAMMATION · BNP = STRETCH, so volume · troponin = INJURY (“troponin is your friend”). “If you have troponin, don't even waste your time ordering a CK.”</w:t>
+            </w:r>
+          </w:p>
+        </w:tc>
+      </w:tr>
+      <w:tr>
+        <w:tc>
+          <w:tcPr>
+            <w:tcW w:type="dxa" w:w="5112"/>
+            <w:shd w:val="clear" w:color="auto" w:fill="F1EEEF"/>
+          </w:tcPr>
+          <w:p>
+            <w:pPr>
+              <w:spacing w:after="40"/>
+            </w:pPr>
+            <w:r>
+              <w:rPr>
+                <w:b/>
+                <w:sz w:val="18"/>
+              </w:rPr>
+            </w:r>
+            <w:r>
+              <w:rPr>
+                <w:b/>
+                <w:i w:val="0"/>
+                <w:sz w:val="18"/>
+              </w:rPr>
               <w:t>The frame</w:t>
             </w:r>
           </w:p>
@@ -4541,6 +4641,56 @@
                 <w:i w:val="0"/>
                 <w:sz w:val="18"/>
               </w:rPr>
+              <w:t>★ Acute chest pain, in full</w:t>
+            </w:r>
+          </w:p>
+        </w:tc>
+        <w:tc>
+          <w:tcPr>
+            <w:tcW w:type="dxa" w:w="5112"/>
+          </w:tcPr>
+          <w:p>
+            <w:pPr>
+              <w:spacing w:after="40"/>
+            </w:pPr>
+            <w:r>
+              <w:rPr>
+                <w:sz w:val="18"/>
+              </w:rPr>
+            </w:r>
+            <w:r>
+              <w:rPr>
+                <w:b w:val="0"/>
+                <w:i w:val="0"/>
+                <w:sz w:val="18"/>
+              </w:rPr>
+              <w:t>Troponin + EKG as soon as possible, plus a metabolic panel for KIDNEY FUNCTION (to read the troponin, for cath-lab contrast, for diabetes and hypertension). hs-CRP is “an office visit type lab”, never the chest-pain answer.</w:t>
+            </w:r>
+          </w:p>
+        </w:tc>
+      </w:tr>
+      <w:tr>
+        <w:tc>
+          <w:tcPr>
+            <w:tcW w:type="dxa" w:w="5112"/>
+            <w:shd w:val="clear" w:color="auto" w:fill="F1EEEF"/>
+          </w:tcPr>
+          <w:p>
+            <w:pPr>
+              <w:spacing w:after="40"/>
+            </w:pPr>
+            <w:r>
+              <w:rPr>
+                <w:b/>
+                <w:sz w:val="18"/>
+              </w:rPr>
+            </w:r>
+            <w:r>
+              <w:rPr>
+                <w:b/>
+                <w:i w:val="0"/>
+                <w:sz w:val="18"/>
+              </w:rPr>
               <w:t>Chest pain</w:t>
             </w:r>
           </w:p>
@@ -5329,6 +5479,106 @@
                 <w:i w:val="0"/>
                 <w:sz w:val="18"/>
               </w:rPr>
+              <w:t>★ LDL-C goal, both ends</w:t>
+            </w:r>
+          </w:p>
+        </w:tc>
+        <w:tc>
+          <w:tcPr>
+            <w:tcW w:type="dxa" w:w="5112"/>
+          </w:tcPr>
+          <w:p>
+            <w:pPr>
+              <w:spacing w:after="40"/>
+            </w:pPr>
+            <w:r>
+              <w:rPr>
+                <w:sz w:val="18"/>
+              </w:rPr>
+            </w:r>
+            <w:r>
+              <w:rPr>
+                <w:b w:val="0"/>
+                <w:i w:val="0"/>
+                <w:sz w:val="18"/>
+              </w:rPr>
+              <w:t>No single normal, so know the ends: average risk UNDER 100 · highest risk UNDER 55 (middle tier under 70). “LDL is the big one.” Golf, not bowling.</w:t>
+            </w:r>
+          </w:p>
+        </w:tc>
+      </w:tr>
+      <w:tr>
+        <w:tc>
+          <w:tcPr>
+            <w:tcW w:type="dxa" w:w="5112"/>
+            <w:shd w:val="clear" w:color="auto" w:fill="F1EEEF"/>
+          </w:tcPr>
+          <w:p>
+            <w:pPr>
+              <w:spacing w:after="40"/>
+            </w:pPr>
+            <w:r>
+              <w:rPr>
+                <w:b/>
+                <w:sz w:val="18"/>
+              </w:rPr>
+            </w:r>
+            <w:r>
+              <w:rPr>
+                <w:b/>
+                <w:i w:val="0"/>
+                <w:sz w:val="18"/>
+              </w:rPr>
+              <w:t>★ Well patient + family history</w:t>
+            </w:r>
+          </w:p>
+        </w:tc>
+        <w:tc>
+          <w:tcPr>
+            <w:tcW w:type="dxa" w:w="5112"/>
+          </w:tcPr>
+          <w:p>
+            <w:pPr>
+              <w:spacing w:after="40"/>
+            </w:pPr>
+            <w:r>
+              <w:rPr>
+                <w:sz w:val="18"/>
+              </w:rPr>
+            </w:r>
+            <w:r>
+              <w:rPr>
+                <w:b w:val="0"/>
+                <w:i w:val="0"/>
+                <w:sz w:val="18"/>
+              </w:rPr>
+              <w:t>SCREENING, not diagnostic (the slide's asterisk): fasting lipid panel, A1C, lipoprotein(a) if never measured.</w:t>
+            </w:r>
+          </w:p>
+        </w:tc>
+      </w:tr>
+      <w:tr>
+        <w:tc>
+          <w:tcPr>
+            <w:tcW w:type="dxa" w:w="5112"/>
+            <w:shd w:val="clear" w:color="auto" w:fill="F1EEEF"/>
+          </w:tcPr>
+          <w:p>
+            <w:pPr>
+              <w:spacing w:after="40"/>
+            </w:pPr>
+            <w:r>
+              <w:rPr>
+                <w:b/>
+                <w:sz w:val="18"/>
+              </w:rPr>
+            </w:r>
+            <w:r>
+              <w:rPr>
+                <w:b/>
+                <w:i w:val="0"/>
+                <w:sz w:val="18"/>
+              </w:rPr>
               <w:t>Measured</w:t>
             </w:r>
           </w:p>
@@ -6116,7 +6366,7 @@
           <w:b w:val="0"/>
           <w:i w:val="0"/>
         </w:rPr>
-        <w:t xml:space="preserve"> Condensed from the Principles of Diagnostic Medicine I Exam 2 Study Guide (Class of 2028). Covers Lectures 7–9; Lecture 10 (Coagulation and Hemostasis Testing) is added when its deck is posted. Emphasis rows quote the 15 and 17 September 2026 recordings; the Lecture 9 rows are from the slides alone. </w:t>
+        <w:t xml:space="preserve"> Condensed from the Principles of Diagnostic Medicine I Exam 2 Study Guide (Class of 2028). Covers Lectures 7–9; Lecture 10 (Coagulation and Hemostasis Testing) is added when its deck is posted. Emphasis rows quote the 15, 17 and 21 September 2026 recordings; ★ = emphasized in the Lecture 9 recording. </w:t>
       </w:r>
     </w:p>
     <w:sectPr>

</xml_diff>

<commit_message>
PDM I Exam 2: Lecture 10 Coagulation and Hemostasis Testing (Prof. Reynolds) - study guide section 10, cram rows, two 30-question quizzes, coagulation tests reference chart, 58 Arcade cards, emphasis from the recording
Nine figures from the picture-only slides, every guide link independently verified, recording-versus-slide conflicts keyed to the slide. Exam 2 masters not built.

Co-Authored-By: Claude Sonnet 5.5 <noreply@anthropic.com>
</commit_message>
<xml_diff>
--- a/Principles of Diagnostic Medicine I Exam 2/pdm-exam-2-cram-sheet.docx
+++ b/Principles of Diagnostic Medicine I Exam 2/pdm-exam-2-cram-sheet.docx
@@ -62,7 +62,7 @@
           <w:b w:val="0"/>
           <w:i w:val="0"/>
         </w:rPr>
-        <w:t>Lectures 7, 8 and 9. Electrocardiography — the action potential, the conduction system, paper, leads, rate and the normal intervals. Cardiac imaging — the chest radiograph, echocardiography, stress testing, nuclear, computed tomography, magnetic resonance, angiography and vascular ultrasound. Cardiac biomarkers and lipid testing. Opens with how the exam is written.</w:t>
+        <w:t>Lectures 7, 8, 9 and 10. Electrocardiography — the action potential, the conduction system, paper, leads, rate and the normal intervals. Cardiac imaging — the chest radiograph, echocardiography, stress testing, nuclear, computed tomography, magnetic resonance, angiography and vascular ultrasound. Cardiac biomarkers and lipid testing. Coagulation and hemostasis testing — the three phases, the platelet, PT, INR, aPTT, thrombin time, fibrinogen and D-dimer tests, and how to read the patterns. Opens with how the exam is written.</w:t>
       </w:r>
     </w:p>
     <w:tbl>
@@ -6359,6 +6359,3364 @@
     </w:p>
     <w:p>
       <w:pPr>
+        <w:pStyle w:val="Heading1"/>
+        <w:spacing w:before="280" w:after="100"/>
+      </w:pPr>
+      <w:r>
+        <w:rPr>
+          <w:rFonts w:ascii="Georgia" w:hAnsi="Georgia"/>
+          <w:color w:val="17494B"/>
+        </w:rPr>
+        <w:t>Hemostasis: The Terms &amp; Three Phases</w:t>
+      </w:r>
+    </w:p>
+    <w:tbl>
+      <w:tblPr>
+        <w:tblStyle w:val="TableGrid"/>
+        <w:tblW w:type="auto" w:w="0"/>
+        <w:jc w:val="center"/>
+        <w:tblLook w:firstColumn="1" w:firstRow="1" w:lastColumn="0" w:lastRow="0" w:noHBand="0" w:noVBand="1" w:val="04A0"/>
+        <w:tblBorders>
+          <w:top w:val="single" w:sz="4" w:space="0" w:color="D8D2D4"/>
+          <w:left w:val="single" w:sz="4" w:space="0" w:color="D8D2D4"/>
+          <w:bottom w:val="single" w:sz="4" w:space="0" w:color="D8D2D4"/>
+          <w:right w:val="single" w:sz="4" w:space="0" w:color="D8D2D4"/>
+          <w:insideH w:val="single" w:sz="4" w:space="0" w:color="D8D2D4"/>
+          <w:insideV w:val="single" w:sz="4" w:space="0" w:color="D8D2D4"/>
+        </w:tblBorders>
+      </w:tblPr>
+      <w:tblGrid>
+        <w:gridCol w:w="5112"/>
+        <w:gridCol w:w="5112"/>
+      </w:tblGrid>
+      <w:tr>
+        <w:tc>
+          <w:tcPr>
+            <w:tcW w:type="dxa" w:w="5112"/>
+            <w:shd w:val="clear" w:color="auto" w:fill="17494B"/>
+          </w:tcPr>
+          <w:p>
+            <w:pPr>
+              <w:spacing w:after="40"/>
+            </w:pPr>
+            <w:r>
+              <w:rPr>
+                <w:b/>
+                <w:color w:val="FFFFFF"/>
+                <w:sz w:val="18"/>
+              </w:rPr>
+            </w:r>
+            <w:r>
+              <w:rPr>
+                <w:b/>
+                <w:i w:val="0"/>
+                <w:color w:val="FFFFFF"/>
+                <w:sz w:val="18"/>
+              </w:rPr>
+              <w:t>Term</w:t>
+            </w:r>
+          </w:p>
+        </w:tc>
+        <w:tc>
+          <w:tcPr>
+            <w:tcW w:type="dxa" w:w="5112"/>
+            <w:shd w:val="clear" w:color="auto" w:fill="17494B"/>
+          </w:tcPr>
+          <w:p>
+            <w:pPr>
+              <w:spacing w:after="40"/>
+            </w:pPr>
+            <w:r>
+              <w:rPr>
+                <w:b/>
+                <w:color w:val="FFFFFF"/>
+                <w:sz w:val="18"/>
+              </w:rPr>
+            </w:r>
+            <w:r>
+              <w:rPr>
+                <w:b/>
+                <w:i w:val="0"/>
+                <w:color w:val="FFFFFF"/>
+                <w:sz w:val="18"/>
+              </w:rPr>
+              <w:t>What you need to know</w:t>
+            </w:r>
+          </w:p>
+        </w:tc>
+      </w:tr>
+      <w:tr>
+        <w:tc>
+          <w:tcPr>
+            <w:tcW w:type="dxa" w:w="5112"/>
+            <w:shd w:val="clear" w:color="auto" w:fill="F1EEEF"/>
+          </w:tcPr>
+          <w:p>
+            <w:pPr>
+              <w:spacing w:after="40"/>
+            </w:pPr>
+            <w:r>
+              <w:rPr>
+                <w:b/>
+                <w:sz w:val="18"/>
+              </w:rPr>
+            </w:r>
+            <w:r>
+              <w:rPr>
+                <w:b/>
+                <w:i w:val="0"/>
+                <w:sz w:val="18"/>
+              </w:rPr>
+              <w:t>★ The frame (three phases)</w:t>
+            </w:r>
+          </w:p>
+        </w:tc>
+        <w:tc>
+          <w:tcPr>
+            <w:tcW w:type="dxa" w:w="5112"/>
+          </w:tcPr>
+          <w:p>
+            <w:pPr>
+              <w:spacing w:after="40"/>
+            </w:pPr>
+            <w:r>
+              <w:rPr>
+                <w:sz w:val="18"/>
+              </w:rPr>
+            </w:r>
+            <w:r>
+              <w:rPr>
+                <w:b w:val="0"/>
+                <w:i w:val="0"/>
+                <w:sz w:val="18"/>
+              </w:rPr>
+              <w:t>Hemostasis = the BALANCE between clot formation and clot breakdown. EACH TEST evaluates ONE PART of that balance.</w:t>
+            </w:r>
+          </w:p>
+        </w:tc>
+      </w:tr>
+      <w:tr>
+        <w:tc>
+          <w:tcPr>
+            <w:tcW w:type="dxa" w:w="5112"/>
+            <w:shd w:val="clear" w:color="auto" w:fill="F1EEEF"/>
+          </w:tcPr>
+          <w:p>
+            <w:pPr>
+              <w:spacing w:after="40"/>
+            </w:pPr>
+            <w:r>
+              <w:rPr>
+                <w:b/>
+                <w:sz w:val="18"/>
+              </w:rPr>
+            </w:r>
+            <w:r>
+              <w:rPr>
+                <w:b/>
+                <w:i w:val="0"/>
+                <w:sz w:val="18"/>
+              </w:rPr>
+              <w:t>Hemostasis</w:t>
+            </w:r>
+          </w:p>
+        </w:tc>
+        <w:tc>
+          <w:tcPr>
+            <w:tcW w:type="dxa" w:w="5112"/>
+          </w:tcPr>
+          <w:p>
+            <w:pPr>
+              <w:spacing w:after="40"/>
+            </w:pPr>
+            <w:r>
+              <w:rPr>
+                <w:sz w:val="18"/>
+              </w:rPr>
+            </w:r>
+            <w:r>
+              <w:rPr>
+                <w:b w:val="0"/>
+                <w:i w:val="0"/>
+                <w:sz w:val="18"/>
+              </w:rPr>
+              <w:t>Arrest of bleeding from an injured vessel, while preventing pathologic thrombosis.</w:t>
+            </w:r>
+          </w:p>
+        </w:tc>
+      </w:tr>
+      <w:tr>
+        <w:tc>
+          <w:tcPr>
+            <w:tcW w:type="dxa" w:w="5112"/>
+            <w:shd w:val="clear" w:color="auto" w:fill="F1EEEF"/>
+          </w:tcPr>
+          <w:p>
+            <w:pPr>
+              <w:spacing w:after="40"/>
+            </w:pPr>
+            <w:r>
+              <w:rPr>
+                <w:b/>
+                <w:sz w:val="18"/>
+              </w:rPr>
+            </w:r>
+            <w:r>
+              <w:rPr>
+                <w:b/>
+                <w:i w:val="0"/>
+                <w:sz w:val="18"/>
+              </w:rPr>
+              <w:t>Primary hemostasis</w:t>
+            </w:r>
+          </w:p>
+        </w:tc>
+        <w:tc>
+          <w:tcPr>
+            <w:tcW w:type="dxa" w:w="5112"/>
+          </w:tcPr>
+          <w:p>
+            <w:pPr>
+              <w:spacing w:after="40"/>
+            </w:pPr>
+            <w:r>
+              <w:rPr>
+                <w:sz w:val="18"/>
+              </w:rPr>
+            </w:r>
+            <w:r>
+              <w:rPr>
+                <w:b w:val="0"/>
+                <w:i w:val="0"/>
+                <w:sz w:val="18"/>
+              </w:rPr>
+              <w:t>Formation of a PLATELET PLUG at the site of injury. von Willebrand factor tethers platelets to collagen; they aggregate through glycoprotein IIb/IIIa.</w:t>
+            </w:r>
+          </w:p>
+        </w:tc>
+      </w:tr>
+      <w:tr>
+        <w:tc>
+          <w:tcPr>
+            <w:tcW w:type="dxa" w:w="5112"/>
+            <w:shd w:val="clear" w:color="auto" w:fill="F1EEEF"/>
+          </w:tcPr>
+          <w:p>
+            <w:pPr>
+              <w:spacing w:after="40"/>
+            </w:pPr>
+            <w:r>
+              <w:rPr>
+                <w:b/>
+                <w:sz w:val="18"/>
+              </w:rPr>
+            </w:r>
+            <w:r>
+              <w:rPr>
+                <w:b/>
+                <w:i w:val="0"/>
+                <w:sz w:val="18"/>
+              </w:rPr>
+              <w:t>Secondary hemostasis</w:t>
+            </w:r>
+          </w:p>
+        </w:tc>
+        <w:tc>
+          <w:tcPr>
+            <w:tcW w:type="dxa" w:w="5112"/>
+          </w:tcPr>
+          <w:p>
+            <w:pPr>
+              <w:spacing w:after="40"/>
+            </w:pPr>
+            <w:r>
+              <w:rPr>
+                <w:sz w:val="18"/>
+              </w:rPr>
+            </w:r>
+            <w:r>
+              <w:rPr>
+                <w:b w:val="0"/>
+                <w:i w:val="0"/>
+                <w:sz w:val="18"/>
+              </w:rPr>
+              <w:t>Insoluble, cross-linked FIBRIN from activated coagulation factors, specifically THROMBIN (the cascade).</w:t>
+            </w:r>
+          </w:p>
+        </w:tc>
+      </w:tr>
+      <w:tr>
+        <w:tc>
+          <w:tcPr>
+            <w:tcW w:type="dxa" w:w="5112"/>
+            <w:shd w:val="clear" w:color="auto" w:fill="F1EEEF"/>
+          </w:tcPr>
+          <w:p>
+            <w:pPr>
+              <w:spacing w:after="40"/>
+            </w:pPr>
+            <w:r>
+              <w:rPr>
+                <w:b/>
+                <w:sz w:val="18"/>
+              </w:rPr>
+            </w:r>
+            <w:r>
+              <w:rPr>
+                <w:b/>
+                <w:i w:val="0"/>
+                <w:sz w:val="18"/>
+              </w:rPr>
+              <w:t>Thrombus</w:t>
+            </w:r>
+          </w:p>
+        </w:tc>
+        <w:tc>
+          <w:tcPr>
+            <w:tcW w:type="dxa" w:w="5112"/>
+          </w:tcPr>
+          <w:p>
+            <w:pPr>
+              <w:spacing w:after="40"/>
+            </w:pPr>
+            <w:r>
+              <w:rPr>
+                <w:sz w:val="18"/>
+              </w:rPr>
+            </w:r>
+            <w:r>
+              <w:rPr>
+                <w:b w:val="0"/>
+                <w:i w:val="0"/>
+                <w:sz w:val="18"/>
+              </w:rPr>
+              <w:t>A clot formed IN SITU within the vascular system that impedes flow.</w:t>
+            </w:r>
+          </w:p>
+        </w:tc>
+      </w:tr>
+      <w:tr>
+        <w:tc>
+          <w:tcPr>
+            <w:tcW w:type="dxa" w:w="5112"/>
+            <w:shd w:val="clear" w:color="auto" w:fill="F1EEEF"/>
+          </w:tcPr>
+          <w:p>
+            <w:pPr>
+              <w:spacing w:after="40"/>
+            </w:pPr>
+            <w:r>
+              <w:rPr>
+                <w:b/>
+                <w:sz w:val="18"/>
+              </w:rPr>
+            </w:r>
+            <w:r>
+              <w:rPr>
+                <w:b/>
+                <w:i w:val="0"/>
+                <w:sz w:val="18"/>
+              </w:rPr>
+              <w:t>Fibrinolysis</w:t>
+            </w:r>
+          </w:p>
+        </w:tc>
+        <w:tc>
+          <w:tcPr>
+            <w:tcW w:type="dxa" w:w="5112"/>
+          </w:tcPr>
+          <w:p>
+            <w:pPr>
+              <w:spacing w:after="40"/>
+            </w:pPr>
+            <w:r>
+              <w:rPr>
+                <w:sz w:val="18"/>
+              </w:rPr>
+            </w:r>
+            <w:r>
+              <w:rPr>
+                <w:b w:val="0"/>
+                <w:i w:val="0"/>
+                <w:sz w:val="18"/>
+              </w:rPr>
+              <w:t>Enzymatic breakdown of fibrin: tissue plasminogen activator makes PLASMIN, which degrades fibrin.</w:t>
+            </w:r>
+          </w:p>
+        </w:tc>
+      </w:tr>
+      <w:tr>
+        <w:tc>
+          <w:tcPr>
+            <w:tcW w:type="dxa" w:w="5112"/>
+            <w:shd w:val="clear" w:color="auto" w:fill="F1EEEF"/>
+          </w:tcPr>
+          <w:p>
+            <w:pPr>
+              <w:spacing w:after="40"/>
+            </w:pPr>
+            <w:r>
+              <w:rPr>
+                <w:b/>
+                <w:sz w:val="18"/>
+              </w:rPr>
+            </w:r>
+            <w:r>
+              <w:rPr>
+                <w:b/>
+                <w:i w:val="0"/>
+                <w:sz w:val="18"/>
+              </w:rPr>
+              <w:t>Fibrin degradation products</w:t>
+            </w:r>
+          </w:p>
+        </w:tc>
+        <w:tc>
+          <w:tcPr>
+            <w:tcW w:type="dxa" w:w="5112"/>
+          </w:tcPr>
+          <w:p>
+            <w:pPr>
+              <w:spacing w:after="40"/>
+            </w:pPr>
+            <w:r>
+              <w:rPr>
+                <w:sz w:val="18"/>
+              </w:rPr>
+            </w:r>
+            <w:r>
+              <w:rPr>
+                <w:b w:val="0"/>
+                <w:i w:val="0"/>
+                <w:sz w:val="18"/>
+              </w:rPr>
+              <w:t>Fragments after PLASMIN degrades fibrinogen or fibrin; markedly raised in disseminated intravascular coagulation.</w:t>
+            </w:r>
+          </w:p>
+        </w:tc>
+      </w:tr>
+      <w:tr>
+        <w:tc>
+          <w:tcPr>
+            <w:tcW w:type="dxa" w:w="5112"/>
+            <w:shd w:val="clear" w:color="auto" w:fill="F1EEEF"/>
+          </w:tcPr>
+          <w:p>
+            <w:pPr>
+              <w:spacing w:after="40"/>
+            </w:pPr>
+            <w:r>
+              <w:rPr>
+                <w:b/>
+                <w:sz w:val="18"/>
+              </w:rPr>
+            </w:r>
+            <w:r>
+              <w:rPr>
+                <w:b/>
+                <w:i w:val="0"/>
+                <w:sz w:val="18"/>
+              </w:rPr>
+              <w:t>D-dimer</w:t>
+            </w:r>
+          </w:p>
+        </w:tc>
+        <w:tc>
+          <w:tcPr>
+            <w:tcW w:type="dxa" w:w="5112"/>
+          </w:tcPr>
+          <w:p>
+            <w:pPr>
+              <w:spacing w:after="40"/>
+            </w:pPr>
+            <w:r>
+              <w:rPr>
+                <w:sz w:val="18"/>
+              </w:rPr>
+            </w:r>
+            <w:r>
+              <w:rPr>
+                <w:b w:val="0"/>
+                <w:i w:val="0"/>
+                <w:sz w:val="18"/>
+              </w:rPr>
+              <w:t>A cross-linked fibrin degradation product from THREE enzymes: thrombin, activated factor XIII, plasmin.</w:t>
+            </w:r>
+          </w:p>
+        </w:tc>
+      </w:tr>
+      <w:tr>
+        <w:tc>
+          <w:tcPr>
+            <w:tcW w:type="dxa" w:w="5112"/>
+            <w:shd w:val="clear" w:color="auto" w:fill="F1EEEF"/>
+          </w:tcPr>
+          <w:p>
+            <w:pPr>
+              <w:spacing w:after="40"/>
+            </w:pPr>
+            <w:r>
+              <w:rPr>
+                <w:b/>
+                <w:sz w:val="18"/>
+              </w:rPr>
+            </w:r>
+            <w:r>
+              <w:rPr>
+                <w:b/>
+                <w:i w:val="0"/>
+                <w:sz w:val="18"/>
+              </w:rPr>
+              <w:t>Pathway map</w:t>
+            </w:r>
+          </w:p>
+        </w:tc>
+        <w:tc>
+          <w:tcPr>
+            <w:tcW w:type="dxa" w:w="5112"/>
+          </w:tcPr>
+          <w:p>
+            <w:pPr>
+              <w:spacing w:after="40"/>
+            </w:pPr>
+            <w:r>
+              <w:rPr>
+                <w:sz w:val="18"/>
+              </w:rPr>
+            </w:r>
+            <w:r>
+              <w:rPr>
+                <w:b w:val="0"/>
+                <w:i w:val="0"/>
+                <w:sz w:val="18"/>
+              </w:rPr>
+              <w:t>Extrinsic = tissue factor + factor VII. Intrinsic = XII, XI, IX, VIII. Both feed factor X; common = X, V, II, I, XIII. Thrombin activates VIII, V and XIII. Vitamin K deficiency hits II, VII, IX, X.</w:t>
+            </w:r>
+          </w:p>
+        </w:tc>
+      </w:tr>
+    </w:tbl>
+    <w:p>
+      <w:pPr>
+        <w:spacing w:after="80"/>
+      </w:pPr>
+    </w:p>
+    <w:p>
+      <w:pPr>
+        <w:pStyle w:val="Heading1"/>
+        <w:spacing w:before="280" w:after="100"/>
+      </w:pPr>
+      <w:r>
+        <w:rPr>
+          <w:rFonts w:ascii="Georgia" w:hAnsi="Georgia"/>
+          <w:color w:val="17494B"/>
+        </w:rPr>
+        <w:t>Primary Hemostasis Tests (Platelets)</w:t>
+      </w:r>
+    </w:p>
+    <w:tbl>
+      <w:tblPr>
+        <w:tblStyle w:val="TableGrid"/>
+        <w:tblW w:type="auto" w:w="0"/>
+        <w:jc w:val="center"/>
+        <w:tblLook w:firstColumn="1" w:firstRow="1" w:lastColumn="0" w:lastRow="0" w:noHBand="0" w:noVBand="1" w:val="04A0"/>
+        <w:tblBorders>
+          <w:top w:val="single" w:sz="4" w:space="0" w:color="D8D2D4"/>
+          <w:left w:val="single" w:sz="4" w:space="0" w:color="D8D2D4"/>
+          <w:bottom w:val="single" w:sz="4" w:space="0" w:color="D8D2D4"/>
+          <w:right w:val="single" w:sz="4" w:space="0" w:color="D8D2D4"/>
+          <w:insideH w:val="single" w:sz="4" w:space="0" w:color="D8D2D4"/>
+          <w:insideV w:val="single" w:sz="4" w:space="0" w:color="D8D2D4"/>
+        </w:tblBorders>
+      </w:tblPr>
+      <w:tblGrid>
+        <w:gridCol w:w="5112"/>
+        <w:gridCol w:w="5112"/>
+      </w:tblGrid>
+      <w:tr>
+        <w:tc>
+          <w:tcPr>
+            <w:tcW w:type="dxa" w:w="5112"/>
+            <w:shd w:val="clear" w:color="auto" w:fill="17494B"/>
+          </w:tcPr>
+          <w:p>
+            <w:pPr>
+              <w:spacing w:after="40"/>
+            </w:pPr>
+            <w:r>
+              <w:rPr>
+                <w:b/>
+                <w:color w:val="FFFFFF"/>
+                <w:sz w:val="18"/>
+              </w:rPr>
+            </w:r>
+            <w:r>
+              <w:rPr>
+                <w:b/>
+                <w:i w:val="0"/>
+                <w:color w:val="FFFFFF"/>
+                <w:sz w:val="18"/>
+              </w:rPr>
+              <w:t>Term</w:t>
+            </w:r>
+          </w:p>
+        </w:tc>
+        <w:tc>
+          <w:tcPr>
+            <w:tcW w:type="dxa" w:w="5112"/>
+            <w:shd w:val="clear" w:color="auto" w:fill="17494B"/>
+          </w:tcPr>
+          <w:p>
+            <w:pPr>
+              <w:spacing w:after="40"/>
+            </w:pPr>
+            <w:r>
+              <w:rPr>
+                <w:b/>
+                <w:color w:val="FFFFFF"/>
+                <w:sz w:val="18"/>
+              </w:rPr>
+            </w:r>
+            <w:r>
+              <w:rPr>
+                <w:b/>
+                <w:i w:val="0"/>
+                <w:color w:val="FFFFFF"/>
+                <w:sz w:val="18"/>
+              </w:rPr>
+              <w:t>What you need to know</w:t>
+            </w:r>
+          </w:p>
+        </w:tc>
+      </w:tr>
+      <w:tr>
+        <w:tc>
+          <w:tcPr>
+            <w:tcW w:type="dxa" w:w="5112"/>
+            <w:shd w:val="clear" w:color="auto" w:fill="F1EEEF"/>
+          </w:tcPr>
+          <w:p>
+            <w:pPr>
+              <w:spacing w:after="40"/>
+            </w:pPr>
+            <w:r>
+              <w:rPr>
+                <w:b/>
+                <w:sz w:val="18"/>
+              </w:rPr>
+            </w:r>
+            <w:r>
+              <w:rPr>
+                <w:b/>
+                <w:i w:val="0"/>
+                <w:sz w:val="18"/>
+              </w:rPr>
+              <w:t>Platelet count</w:t>
+            </w:r>
+          </w:p>
+        </w:tc>
+        <w:tc>
+          <w:tcPr>
+            <w:tcW w:type="dxa" w:w="5112"/>
+          </w:tcPr>
+          <w:p>
+            <w:pPr>
+              <w:spacing w:after="40"/>
+            </w:pPr>
+            <w:r>
+              <w:rPr>
+                <w:sz w:val="18"/>
+              </w:rPr>
+            </w:r>
+            <w:r>
+              <w:rPr>
+                <w:b w:val="0"/>
+                <w:i w:val="0"/>
+                <w:sz w:val="18"/>
+              </w:rPr>
+              <w:t>Adults 140,000–400,000 per microliter. The deck calls thrombocytopenia below 100,000 and thrombocytosis above 350,000.</w:t>
+            </w:r>
+          </w:p>
+        </w:tc>
+      </w:tr>
+      <w:tr>
+        <w:tc>
+          <w:tcPr>
+            <w:tcW w:type="dxa" w:w="5112"/>
+            <w:shd w:val="clear" w:color="auto" w:fill="F1EEEF"/>
+          </w:tcPr>
+          <w:p>
+            <w:pPr>
+              <w:spacing w:after="40"/>
+            </w:pPr>
+            <w:r>
+              <w:rPr>
+                <w:b/>
+                <w:sz w:val="18"/>
+              </w:rPr>
+            </w:r>
+            <w:r>
+              <w:rPr>
+                <w:b/>
+                <w:i w:val="0"/>
+                <w:sz w:val="18"/>
+              </w:rPr>
+              <w:t>Mean platelet volume</w:t>
+            </w:r>
+          </w:p>
+        </w:tc>
+        <w:tc>
+          <w:tcPr>
+            <w:tcW w:type="dxa" w:w="5112"/>
+          </w:tcPr>
+          <w:p>
+            <w:pPr>
+              <w:spacing w:after="40"/>
+            </w:pPr>
+            <w:r>
+              <w:rPr>
+                <w:sz w:val="18"/>
+              </w:rPr>
+            </w:r>
+            <w:r>
+              <w:rPr>
+                <w:b w:val="0"/>
+                <w:i w:val="0"/>
+                <w:sz w:val="18"/>
+              </w:rPr>
+              <w:t>UNIFORMITY OF PLATELET SIZE; used in the differential diagnosis of thrombocytopenia. Normal 7.4–10.4 femtoliters.</w:t>
+            </w:r>
+          </w:p>
+        </w:tc>
+      </w:tr>
+      <w:tr>
+        <w:tc>
+          <w:tcPr>
+            <w:tcW w:type="dxa" w:w="5112"/>
+            <w:shd w:val="clear" w:color="auto" w:fill="F1EEEF"/>
+          </w:tcPr>
+          <w:p>
+            <w:pPr>
+              <w:spacing w:after="40"/>
+            </w:pPr>
+            <w:r>
+              <w:rPr>
+                <w:b/>
+                <w:sz w:val="18"/>
+              </w:rPr>
+            </w:r>
+            <w:r>
+              <w:rPr>
+                <w:b/>
+                <w:i w:val="0"/>
+                <w:sz w:val="18"/>
+              </w:rPr>
+              <w:t>Smear</w:t>
+            </w:r>
+          </w:p>
+        </w:tc>
+        <w:tc>
+          <w:tcPr>
+            <w:tcW w:type="dxa" w:w="5112"/>
+          </w:tcPr>
+          <w:p>
+            <w:pPr>
+              <w:spacing w:after="40"/>
+            </w:pPr>
+            <w:r>
+              <w:rPr>
+                <w:sz w:val="18"/>
+              </w:rPr>
+            </w:r>
+            <w:r>
+              <w:rPr>
+                <w:b w:val="0"/>
+                <w:i w:val="0"/>
+                <w:sz w:val="18"/>
+              </w:rPr>
+              <w:t>Platelet MORPHOLOGY: macrothrombocytopenia, gray platelets, neutrophil inclusions, clumps.</w:t>
+            </w:r>
+          </w:p>
+        </w:tc>
+      </w:tr>
+      <w:tr>
+        <w:tc>
+          <w:tcPr>
+            <w:tcW w:type="dxa" w:w="5112"/>
+            <w:shd w:val="clear" w:color="auto" w:fill="F1EEEF"/>
+          </w:tcPr>
+          <w:p>
+            <w:pPr>
+              <w:spacing w:after="40"/>
+            </w:pPr>
+            <w:r>
+              <w:rPr>
+                <w:b/>
+                <w:sz w:val="18"/>
+              </w:rPr>
+            </w:r>
+            <w:r>
+              <w:rPr>
+                <w:b/>
+                <w:i w:val="0"/>
+                <w:sz w:val="18"/>
+              </w:rPr>
+              <w:t>★ von Willebrand studies</w:t>
+            </w:r>
+          </w:p>
+        </w:tc>
+        <w:tc>
+          <w:tcPr>
+            <w:tcW w:type="dxa" w:w="5112"/>
+          </w:tcPr>
+          <w:p>
+            <w:pPr>
+              <w:spacing w:after="40"/>
+            </w:pPr>
+            <w:r>
+              <w:rPr>
+                <w:sz w:val="18"/>
+              </w:rPr>
+            </w:r>
+            <w:r>
+              <w:rPr>
+                <w:b w:val="0"/>
+                <w:i w:val="0"/>
+                <w:sz w:val="18"/>
+              </w:rPr>
+              <w:t>von Willebrand factor ANTIGEN and ACTIVITY plus a factor VIII level. von Willebrand disease = MOST COMMON inherited bleeding disorder.</w:t>
+            </w:r>
+          </w:p>
+        </w:tc>
+      </w:tr>
+      <w:tr>
+        <w:tc>
+          <w:tcPr>
+            <w:tcW w:type="dxa" w:w="5112"/>
+            <w:shd w:val="clear" w:color="auto" w:fill="F1EEEF"/>
+          </w:tcPr>
+          <w:p>
+            <w:pPr>
+              <w:spacing w:after="40"/>
+            </w:pPr>
+            <w:r>
+              <w:rPr>
+                <w:b/>
+                <w:sz w:val="18"/>
+              </w:rPr>
+            </w:r>
+            <w:r>
+              <w:rPr>
+                <w:b/>
+                <w:i w:val="0"/>
+                <w:sz w:val="18"/>
+              </w:rPr>
+              <w:t>Platelet function tests</w:t>
+            </w:r>
+          </w:p>
+        </w:tc>
+        <w:tc>
+          <w:tcPr>
+            <w:tcW w:type="dxa" w:w="5112"/>
+          </w:tcPr>
+          <w:p>
+            <w:pPr>
+              <w:spacing w:after="40"/>
+            </w:pPr>
+            <w:r>
+              <w:rPr>
+                <w:sz w:val="18"/>
+              </w:rPr>
+            </w:r>
+            <w:r>
+              <w:rPr>
+                <w:b w:val="0"/>
+                <w:i w:val="0"/>
+                <w:sz w:val="18"/>
+              </w:rPr>
+              <w:t>Light transmission aggregometry, lumiaggregometry, platelet function analyzer (PFA-100), flow cytometry.</w:t>
+            </w:r>
+          </w:p>
+        </w:tc>
+      </w:tr>
+      <w:tr>
+        <w:tc>
+          <w:tcPr>
+            <w:tcW w:type="dxa" w:w="5112"/>
+            <w:shd w:val="clear" w:color="auto" w:fill="F1EEEF"/>
+          </w:tcPr>
+          <w:p>
+            <w:pPr>
+              <w:spacing w:after="40"/>
+            </w:pPr>
+            <w:r>
+              <w:rPr>
+                <w:b/>
+                <w:sz w:val="18"/>
+              </w:rPr>
+            </w:r>
+            <w:r>
+              <w:rPr>
+                <w:b/>
+                <w:i w:val="0"/>
+                <w:sz w:val="18"/>
+              </w:rPr>
+              <w:t>Bleeding time</w:t>
+            </w:r>
+          </w:p>
+        </w:tc>
+        <w:tc>
+          <w:tcPr>
+            <w:tcW w:type="dxa" w:w="5112"/>
+          </w:tcPr>
+          <w:p>
+            <w:pPr>
+              <w:spacing w:after="40"/>
+            </w:pPr>
+            <w:r>
+              <w:rPr>
+                <w:sz w:val="18"/>
+              </w:rPr>
+            </w:r>
+            <w:r>
+              <w:rPr>
+                <w:b w:val="0"/>
+                <w:i w:val="0"/>
+                <w:sz w:val="18"/>
+              </w:rPr>
+              <w:t>Minutes for a standard skin puncture to stop bleeding (3–10). ONLY USEFUL if the platelet count is ABOVE 100,000, because thrombocytopenia itself lengthens it. Largely replaced in practice.</w:t>
+            </w:r>
+          </w:p>
+        </w:tc>
+      </w:tr>
+      <w:tr>
+        <w:tc>
+          <w:tcPr>
+            <w:tcW w:type="dxa" w:w="5112"/>
+            <w:shd w:val="clear" w:color="auto" w:fill="F1EEEF"/>
+          </w:tcPr>
+          <w:p>
+            <w:pPr>
+              <w:spacing w:after="40"/>
+            </w:pPr>
+            <w:r>
+              <w:rPr>
+                <w:b/>
+                <w:sz w:val="18"/>
+              </w:rPr>
+            </w:r>
+            <w:r>
+              <w:rPr>
+                <w:b/>
+                <w:i w:val="0"/>
+                <w:sz w:val="18"/>
+              </w:rPr>
+              <w:t>False low count</w:t>
+            </w:r>
+          </w:p>
+        </w:tc>
+        <w:tc>
+          <w:tcPr>
+            <w:tcW w:type="dxa" w:w="5112"/>
+          </w:tcPr>
+          <w:p>
+            <w:pPr>
+              <w:spacing w:after="40"/>
+            </w:pPr>
+            <w:r>
+              <w:rPr>
+                <w:sz w:val="18"/>
+              </w:rPr>
+            </w:r>
+            <w:r>
+              <w:rPr>
+                <w:b w:val="0"/>
+                <w:i w:val="0"/>
+                <w:sz w:val="18"/>
+              </w:rPr>
+              <w:t>Low count? CONFIRM in a citrated or heparinized tube: EDTA (ethylenediaminetetraacetic acid) can make platelets CLUMP (pseudothrombocytopenia). The smear shows clumps and satellitism.</w:t>
+            </w:r>
+          </w:p>
+        </w:tc>
+      </w:tr>
+    </w:tbl>
+    <w:p>
+      <w:pPr>
+        <w:spacing w:after="80"/>
+      </w:pPr>
+    </w:p>
+    <w:p>
+      <w:pPr>
+        <w:pStyle w:val="Heading1"/>
+        <w:spacing w:before="280" w:after="100"/>
+      </w:pPr>
+      <w:r>
+        <w:rPr>
+          <w:rFonts w:ascii="Georgia" w:hAnsi="Georgia"/>
+          <w:color w:val="17494B"/>
+        </w:rPr>
+        <w:t>Secondary Hemostasis Tests</w:t>
+      </w:r>
+    </w:p>
+    <w:tbl>
+      <w:tblPr>
+        <w:tblStyle w:val="TableGrid"/>
+        <w:tblW w:type="auto" w:w="0"/>
+        <w:jc w:val="center"/>
+        <w:tblLook w:firstColumn="1" w:firstRow="1" w:lastColumn="0" w:lastRow="0" w:noHBand="0" w:noVBand="1" w:val="04A0"/>
+        <w:tblBorders>
+          <w:top w:val="single" w:sz="4" w:space="0" w:color="D8D2D4"/>
+          <w:left w:val="single" w:sz="4" w:space="0" w:color="D8D2D4"/>
+          <w:bottom w:val="single" w:sz="4" w:space="0" w:color="D8D2D4"/>
+          <w:right w:val="single" w:sz="4" w:space="0" w:color="D8D2D4"/>
+          <w:insideH w:val="single" w:sz="4" w:space="0" w:color="D8D2D4"/>
+          <w:insideV w:val="single" w:sz="4" w:space="0" w:color="D8D2D4"/>
+        </w:tblBorders>
+      </w:tblPr>
+      <w:tblGrid>
+        <w:gridCol w:w="5112"/>
+        <w:gridCol w:w="5112"/>
+      </w:tblGrid>
+      <w:tr>
+        <w:tc>
+          <w:tcPr>
+            <w:tcW w:type="dxa" w:w="5112"/>
+            <w:shd w:val="clear" w:color="auto" w:fill="17494B"/>
+          </w:tcPr>
+          <w:p>
+            <w:pPr>
+              <w:spacing w:after="40"/>
+            </w:pPr>
+            <w:r>
+              <w:rPr>
+                <w:b/>
+                <w:color w:val="FFFFFF"/>
+                <w:sz w:val="18"/>
+              </w:rPr>
+            </w:r>
+            <w:r>
+              <w:rPr>
+                <w:b/>
+                <w:i w:val="0"/>
+                <w:color w:val="FFFFFF"/>
+                <w:sz w:val="18"/>
+              </w:rPr>
+              <w:t>Term</w:t>
+            </w:r>
+          </w:p>
+        </w:tc>
+        <w:tc>
+          <w:tcPr>
+            <w:tcW w:type="dxa" w:w="5112"/>
+            <w:shd w:val="clear" w:color="auto" w:fill="17494B"/>
+          </w:tcPr>
+          <w:p>
+            <w:pPr>
+              <w:spacing w:after="40"/>
+            </w:pPr>
+            <w:r>
+              <w:rPr>
+                <w:b/>
+                <w:color w:val="FFFFFF"/>
+                <w:sz w:val="18"/>
+              </w:rPr>
+            </w:r>
+            <w:r>
+              <w:rPr>
+                <w:b/>
+                <w:i w:val="0"/>
+                <w:color w:val="FFFFFF"/>
+                <w:sz w:val="18"/>
+              </w:rPr>
+              <w:t>What you need to know</w:t>
+            </w:r>
+          </w:p>
+        </w:tc>
+      </w:tr>
+      <w:tr>
+        <w:tc>
+          <w:tcPr>
+            <w:tcW w:type="dxa" w:w="5112"/>
+            <w:shd w:val="clear" w:color="auto" w:fill="F1EEEF"/>
+          </w:tcPr>
+          <w:p>
+            <w:pPr>
+              <w:spacing w:after="40"/>
+            </w:pPr>
+            <w:r>
+              <w:rPr>
+                <w:b/>
+                <w:sz w:val="18"/>
+              </w:rPr>
+            </w:r>
+            <w:r>
+              <w:rPr>
+                <w:b/>
+                <w:i w:val="0"/>
+                <w:sz w:val="18"/>
+              </w:rPr>
+              <w:t>PT (prothrombin time)</w:t>
+            </w:r>
+          </w:p>
+        </w:tc>
+        <w:tc>
+          <w:tcPr>
+            <w:tcW w:type="dxa" w:w="5112"/>
+          </w:tcPr>
+          <w:p>
+            <w:pPr>
+              <w:spacing w:after="40"/>
+            </w:pPr>
+            <w:r>
+              <w:rPr>
+                <w:sz w:val="18"/>
+              </w:rPr>
+            </w:r>
+            <w:r>
+              <w:rPr>
+                <w:b w:val="0"/>
+                <w:i w:val="0"/>
+                <w:sz w:val="18"/>
+              </w:rPr>
+              <w:t>Clot time after TISSUE FACTOR is added: EXTRINSIC + common. Liver-made, VITAMIN K dependent. Reference 11–13 seconds. Prolonged: factor VII, liver disease, vitamin K deficiency, warfarin.</w:t>
+            </w:r>
+          </w:p>
+        </w:tc>
+      </w:tr>
+      <w:tr>
+        <w:tc>
+          <w:tcPr>
+            <w:tcW w:type="dxa" w:w="5112"/>
+            <w:shd w:val="clear" w:color="auto" w:fill="F1EEEF"/>
+          </w:tcPr>
+          <w:p>
+            <w:pPr>
+              <w:spacing w:after="40"/>
+            </w:pPr>
+            <w:r>
+              <w:rPr>
+                <w:b/>
+                <w:sz w:val="18"/>
+              </w:rPr>
+            </w:r>
+            <w:r>
+              <w:rPr>
+                <w:b/>
+                <w:i w:val="0"/>
+                <w:sz w:val="18"/>
+              </w:rPr>
+              <w:t>★ INR (international normalized ratio)</w:t>
+            </w:r>
+          </w:p>
+        </w:tc>
+        <w:tc>
+          <w:tcPr>
+            <w:tcW w:type="dxa" w:w="5112"/>
+          </w:tcPr>
+          <w:p>
+            <w:pPr>
+              <w:spacing w:after="40"/>
+            </w:pPr>
+            <w:r>
+              <w:rPr>
+                <w:sz w:val="18"/>
+              </w:rPr>
+            </w:r>
+            <w:r>
+              <w:rPr>
+                <w:b w:val="0"/>
+                <w:i w:val="0"/>
+                <w:sz w:val="18"/>
+              </w:rPr>
+              <w:t>PT STANDARDIZED across laboratories. Reference 0.8–1.2; on anticoagulation the goal is typically 2.0–3.0. On warfarin LOW = CLOT risk, HIGH = BLEEDING risk.</w:t>
+            </w:r>
+          </w:p>
+        </w:tc>
+      </w:tr>
+      <w:tr>
+        <w:tc>
+          <w:tcPr>
+            <w:tcW w:type="dxa" w:w="5112"/>
+            <w:shd w:val="clear" w:color="auto" w:fill="F1EEEF"/>
+          </w:tcPr>
+          <w:p>
+            <w:pPr>
+              <w:spacing w:after="40"/>
+            </w:pPr>
+            <w:r>
+              <w:rPr>
+                <w:b/>
+                <w:sz w:val="18"/>
+              </w:rPr>
+            </w:r>
+            <w:r>
+              <w:rPr>
+                <w:b/>
+                <w:i w:val="0"/>
+                <w:sz w:val="18"/>
+              </w:rPr>
+              <w:t>aPTT (activated partial thromboplastin time)</w:t>
+            </w:r>
+          </w:p>
+        </w:tc>
+        <w:tc>
+          <w:tcPr>
+            <w:tcW w:type="dxa" w:w="5112"/>
+          </w:tcPr>
+          <w:p>
+            <w:pPr>
+              <w:spacing w:after="40"/>
+            </w:pPr>
+            <w:r>
+              <w:rPr>
+                <w:sz w:val="18"/>
+              </w:rPr>
+            </w:r>
+            <w:r>
+              <w:rPr>
+                <w:b w:val="0"/>
+                <w:i w:val="0"/>
+                <w:sz w:val="18"/>
+              </w:rPr>
+              <w:t>Clot time after a PHOSPHOLIPID ACTIVATOR: INTRINSIC + common. Reference 21–35 seconds; above 70 seconds signifies spontaneous bleeding. Prolonged: VIII, IX, XI, heparin, inhibitor, lupus anticoagulant, XII.</w:t>
+            </w:r>
+          </w:p>
+        </w:tc>
+      </w:tr>
+      <w:tr>
+        <w:tc>
+          <w:tcPr>
+            <w:tcW w:type="dxa" w:w="5112"/>
+            <w:shd w:val="clear" w:color="auto" w:fill="F1EEEF"/>
+          </w:tcPr>
+          <w:p>
+            <w:pPr>
+              <w:spacing w:after="40"/>
+            </w:pPr>
+            <w:r>
+              <w:rPr>
+                <w:b/>
+                <w:sz w:val="18"/>
+              </w:rPr>
+            </w:r>
+            <w:r>
+              <w:rPr>
+                <w:b/>
+                <w:i w:val="0"/>
+                <w:sz w:val="18"/>
+              </w:rPr>
+              <w:t>Thrombin time</w:t>
+            </w:r>
+          </w:p>
+        </w:tc>
+        <w:tc>
+          <w:tcPr>
+            <w:tcW w:type="dxa" w:w="5112"/>
+          </w:tcPr>
+          <w:p>
+            <w:pPr>
+              <w:spacing w:after="40"/>
+            </w:pPr>
+            <w:r>
+              <w:rPr>
+                <w:sz w:val="18"/>
+              </w:rPr>
+            </w:r>
+            <w:r>
+              <w:rPr>
+                <w:b w:val="0"/>
+                <w:i w:val="0"/>
+                <w:sz w:val="18"/>
+              </w:rPr>
+              <w:t>Raised by HEPARIN and DABIGATRAN; normal in a simple factor deficiency.</w:t>
+            </w:r>
+          </w:p>
+        </w:tc>
+      </w:tr>
+      <w:tr>
+        <w:tc>
+          <w:tcPr>
+            <w:tcW w:type="dxa" w:w="5112"/>
+            <w:shd w:val="clear" w:color="auto" w:fill="F1EEEF"/>
+          </w:tcPr>
+          <w:p>
+            <w:pPr>
+              <w:spacing w:after="40"/>
+            </w:pPr>
+            <w:r>
+              <w:rPr>
+                <w:b/>
+                <w:sz w:val="18"/>
+              </w:rPr>
+            </w:r>
+            <w:r>
+              <w:rPr>
+                <w:b/>
+                <w:i w:val="0"/>
+                <w:sz w:val="18"/>
+              </w:rPr>
+              <w:t>Fibrinogen</w:t>
+            </w:r>
+          </w:p>
+        </w:tc>
+        <w:tc>
+          <w:tcPr>
+            <w:tcW w:type="dxa" w:w="5112"/>
+          </w:tcPr>
+          <w:p>
+            <w:pPr>
+              <w:spacing w:after="40"/>
+            </w:pPr>
+            <w:r>
+              <w:rPr>
+                <w:sz w:val="18"/>
+              </w:rPr>
+            </w:r>
+            <w:r>
+              <w:rPr>
+                <w:b w:val="0"/>
+                <w:i w:val="0"/>
+                <w:sz w:val="18"/>
+              </w:rPr>
+              <w:t>CLAUSS assay preferred. Reference 2.0–4.0 g/L. LOW = BLEED (below 0.5 g/L: hemorrhage after traumatic surgery). HIGH = CLOT (above 7.0 g/L: coronary and cerebrovascular risk). Raised in tissue damage or inflammation.</w:t>
+            </w:r>
+          </w:p>
+        </w:tc>
+      </w:tr>
+      <w:tr>
+        <w:tc>
+          <w:tcPr>
+            <w:tcW w:type="dxa" w:w="5112"/>
+            <w:shd w:val="clear" w:color="auto" w:fill="F1EEEF"/>
+          </w:tcPr>
+          <w:p>
+            <w:pPr>
+              <w:spacing w:after="40"/>
+            </w:pPr>
+            <w:r>
+              <w:rPr>
+                <w:b/>
+                <w:sz w:val="18"/>
+              </w:rPr>
+            </w:r>
+            <w:r>
+              <w:rPr>
+                <w:b/>
+                <w:i w:val="0"/>
+                <w:sz w:val="18"/>
+              </w:rPr>
+              <w:t>Mixing study</w:t>
+            </w:r>
+          </w:p>
+        </w:tc>
+        <w:tc>
+          <w:tcPr>
+            <w:tcW w:type="dxa" w:w="5112"/>
+          </w:tcPr>
+          <w:p>
+            <w:pPr>
+              <w:spacing w:after="40"/>
+            </w:pPr>
+            <w:r>
+              <w:rPr>
+                <w:sz w:val="18"/>
+              </w:rPr>
+            </w:r>
+            <w:r>
+              <w:rPr>
+                <w:b w:val="0"/>
+                <w:i w:val="0"/>
+                <w:sz w:val="18"/>
+              </w:rPr>
+              <w:t>Mix with normal plasma. CORRECTS = factor DEFICIENCY. Does NOT correct = INHIBITOR.</w:t>
+            </w:r>
+          </w:p>
+        </w:tc>
+      </w:tr>
+      <w:tr>
+        <w:tc>
+          <w:tcPr>
+            <w:tcW w:type="dxa" w:w="5112"/>
+            <w:shd w:val="clear" w:color="auto" w:fill="F1EEEF"/>
+          </w:tcPr>
+          <w:p>
+            <w:pPr>
+              <w:spacing w:after="40"/>
+            </w:pPr>
+            <w:r>
+              <w:rPr>
+                <w:b/>
+                <w:sz w:val="18"/>
+              </w:rPr>
+            </w:r>
+            <w:r>
+              <w:rPr>
+                <w:b/>
+                <w:i w:val="0"/>
+                <w:sz w:val="18"/>
+              </w:rPr>
+              <w:t>Factor assays</w:t>
+            </w:r>
+          </w:p>
+        </w:tc>
+        <w:tc>
+          <w:tcPr>
+            <w:tcW w:type="dxa" w:w="5112"/>
+          </w:tcPr>
+          <w:p>
+            <w:pPr>
+              <w:spacing w:after="40"/>
+            </w:pPr>
+            <w:r>
+              <w:rPr>
+                <w:sz w:val="18"/>
+              </w:rPr>
+            </w:r>
+            <w:r>
+              <w:rPr>
+                <w:b w:val="0"/>
+                <w:i w:val="0"/>
+                <w:sz w:val="18"/>
+              </w:rPr>
+              <w:t>CONFIRM a deficiency; inherited or acquired; acquired can raise or lower levels.</w:t>
+            </w:r>
+          </w:p>
+        </w:tc>
+      </w:tr>
+      <w:tr>
+        <w:tc>
+          <w:tcPr>
+            <w:tcW w:type="dxa" w:w="5112"/>
+            <w:shd w:val="clear" w:color="auto" w:fill="F1EEEF"/>
+          </w:tcPr>
+          <w:p>
+            <w:pPr>
+              <w:spacing w:after="40"/>
+            </w:pPr>
+            <w:r>
+              <w:rPr>
+                <w:b/>
+                <w:sz w:val="18"/>
+              </w:rPr>
+            </w:r>
+            <w:r>
+              <w:rPr>
+                <w:b/>
+                <w:i w:val="0"/>
+                <w:sz w:val="18"/>
+              </w:rPr>
+              <w:t>Caveats</w:t>
+            </w:r>
+          </w:p>
+        </w:tc>
+        <w:tc>
+          <w:tcPr>
+            <w:tcW w:type="dxa" w:w="5112"/>
+          </w:tcPr>
+          <w:p>
+            <w:pPr>
+              <w:spacing w:after="40"/>
+            </w:pPr>
+            <w:r>
+              <w:rPr>
+                <w:sz w:val="18"/>
+              </w:rPr>
+            </w:r>
+            <w:r>
+              <w:rPr>
+                <w:b w:val="0"/>
+                <w:i w:val="0"/>
+                <w:sz w:val="18"/>
+              </w:rPr>
+              <w:t>Normal PT/INR does NOT rule out coagulopathy. Low-molecular-weight heparin and most direct oral anticoagulants may not derange PT/aPTT yet raise bleeding risk; no routine monitoring. PREGNANCY: PT, aPTT, thrombin time shorten; fibrinogen and D-dimer RISE. Mild PT/aPTT prolongation does not predict bleeding.</w:t>
+            </w:r>
+          </w:p>
+        </w:tc>
+      </w:tr>
+    </w:tbl>
+    <w:p>
+      <w:pPr>
+        <w:spacing w:after="80"/>
+      </w:pPr>
+    </w:p>
+    <w:p>
+      <w:pPr>
+        <w:pStyle w:val="Heading1"/>
+        <w:spacing w:before="280" w:after="100"/>
+      </w:pPr>
+      <w:r>
+        <w:rPr>
+          <w:rFonts w:ascii="Georgia" w:hAnsi="Georgia"/>
+          <w:color w:val="17494B"/>
+        </w:rPr>
+        <w:t>D-dimer &amp; Fibrinolysis Tests</w:t>
+      </w:r>
+    </w:p>
+    <w:tbl>
+      <w:tblPr>
+        <w:tblStyle w:val="TableGrid"/>
+        <w:tblW w:type="auto" w:w="0"/>
+        <w:jc w:val="center"/>
+        <w:tblLook w:firstColumn="1" w:firstRow="1" w:lastColumn="0" w:lastRow="0" w:noHBand="0" w:noVBand="1" w:val="04A0"/>
+        <w:tblBorders>
+          <w:top w:val="single" w:sz="4" w:space="0" w:color="D8D2D4"/>
+          <w:left w:val="single" w:sz="4" w:space="0" w:color="D8D2D4"/>
+          <w:bottom w:val="single" w:sz="4" w:space="0" w:color="D8D2D4"/>
+          <w:right w:val="single" w:sz="4" w:space="0" w:color="D8D2D4"/>
+          <w:insideH w:val="single" w:sz="4" w:space="0" w:color="D8D2D4"/>
+          <w:insideV w:val="single" w:sz="4" w:space="0" w:color="D8D2D4"/>
+        </w:tblBorders>
+      </w:tblPr>
+      <w:tblGrid>
+        <w:gridCol w:w="5112"/>
+        <w:gridCol w:w="5112"/>
+      </w:tblGrid>
+      <w:tr>
+        <w:tc>
+          <w:tcPr>
+            <w:tcW w:type="dxa" w:w="5112"/>
+            <w:shd w:val="clear" w:color="auto" w:fill="17494B"/>
+          </w:tcPr>
+          <w:p>
+            <w:pPr>
+              <w:spacing w:after="40"/>
+            </w:pPr>
+            <w:r>
+              <w:rPr>
+                <w:b/>
+                <w:color w:val="FFFFFF"/>
+                <w:sz w:val="18"/>
+              </w:rPr>
+            </w:r>
+            <w:r>
+              <w:rPr>
+                <w:b/>
+                <w:i w:val="0"/>
+                <w:color w:val="FFFFFF"/>
+                <w:sz w:val="18"/>
+              </w:rPr>
+              <w:t>Term</w:t>
+            </w:r>
+          </w:p>
+        </w:tc>
+        <w:tc>
+          <w:tcPr>
+            <w:tcW w:type="dxa" w:w="5112"/>
+            <w:shd w:val="clear" w:color="auto" w:fill="17494B"/>
+          </w:tcPr>
+          <w:p>
+            <w:pPr>
+              <w:spacing w:after="40"/>
+            </w:pPr>
+            <w:r>
+              <w:rPr>
+                <w:b/>
+                <w:color w:val="FFFFFF"/>
+                <w:sz w:val="18"/>
+              </w:rPr>
+            </w:r>
+            <w:r>
+              <w:rPr>
+                <w:b/>
+                <w:i w:val="0"/>
+                <w:color w:val="FFFFFF"/>
+                <w:sz w:val="18"/>
+              </w:rPr>
+              <w:t>What you need to know</w:t>
+            </w:r>
+          </w:p>
+        </w:tc>
+      </w:tr>
+      <w:tr>
+        <w:tc>
+          <w:tcPr>
+            <w:tcW w:type="dxa" w:w="5112"/>
+            <w:shd w:val="clear" w:color="auto" w:fill="F1EEEF"/>
+          </w:tcPr>
+          <w:p>
+            <w:pPr>
+              <w:spacing w:after="40"/>
+            </w:pPr>
+            <w:r>
+              <w:rPr>
+                <w:b/>
+                <w:sz w:val="18"/>
+              </w:rPr>
+            </w:r>
+            <w:r>
+              <w:rPr>
+                <w:b/>
+                <w:i w:val="0"/>
+                <w:sz w:val="18"/>
+              </w:rPr>
+              <w:t>D-dimer</w:t>
+            </w:r>
+          </w:p>
+        </w:tc>
+        <w:tc>
+          <w:tcPr>
+            <w:tcW w:type="dxa" w:w="5112"/>
+          </w:tcPr>
+          <w:p>
+            <w:pPr>
+              <w:spacing w:after="40"/>
+            </w:pPr>
+            <w:r>
+              <w:rPr>
+                <w:sz w:val="18"/>
+              </w:rPr>
+            </w:r>
+            <w:r>
+              <w:rPr>
+                <w:b w:val="0"/>
+                <w:i w:val="0"/>
+                <w:sz w:val="18"/>
+              </w:rPr>
+              <w:t>Normal below 250 micrograms per liter. Produced ONLY by plasmin on cross-linked fibrin: confirms BOTH thrombin and plasmin were generated. NONSPECIFIC.</w:t>
+            </w:r>
+          </w:p>
+        </w:tc>
+      </w:tr>
+      <w:tr>
+        <w:tc>
+          <w:tcPr>
+            <w:tcW w:type="dxa" w:w="5112"/>
+            <w:shd w:val="clear" w:color="auto" w:fill="F1EEEF"/>
+          </w:tcPr>
+          <w:p>
+            <w:pPr>
+              <w:spacing w:after="40"/>
+            </w:pPr>
+            <w:r>
+              <w:rPr>
+                <w:b/>
+                <w:sz w:val="18"/>
+              </w:rPr>
+            </w:r>
+            <w:r>
+              <w:rPr>
+                <w:b/>
+                <w:i w:val="0"/>
+                <w:sz w:val="18"/>
+              </w:rPr>
+              <w:t>★ D-dimer: best use</w:t>
+            </w:r>
+          </w:p>
+        </w:tc>
+        <w:tc>
+          <w:tcPr>
+            <w:tcW w:type="dxa" w:w="5112"/>
+          </w:tcPr>
+          <w:p>
+            <w:pPr>
+              <w:spacing w:after="40"/>
+            </w:pPr>
+            <w:r>
+              <w:rPr>
+                <w:sz w:val="18"/>
+              </w:rPr>
+            </w:r>
+            <w:r>
+              <w:rPr>
+                <w:b w:val="0"/>
+                <w:i w:val="0"/>
+                <w:sz w:val="18"/>
+              </w:rPr>
+              <w:t>High NEGATIVE predictive value: a NORMAL result helps EXCLUDE thrombosis. Raised in acute thrombosis, DIC (disseminated intravascular coagulation), pregnancy and many acute illnesses.</w:t>
+            </w:r>
+          </w:p>
+        </w:tc>
+      </w:tr>
+      <w:tr>
+        <w:tc>
+          <w:tcPr>
+            <w:tcW w:type="dxa" w:w="5112"/>
+            <w:shd w:val="clear" w:color="auto" w:fill="F1EEEF"/>
+          </w:tcPr>
+          <w:p>
+            <w:pPr>
+              <w:spacing w:after="40"/>
+            </w:pPr>
+            <w:r>
+              <w:rPr>
+                <w:b/>
+                <w:sz w:val="18"/>
+              </w:rPr>
+            </w:r>
+            <w:r>
+              <w:rPr>
+                <w:b/>
+                <w:i w:val="0"/>
+                <w:sz w:val="18"/>
+              </w:rPr>
+              <w:t>Fibrin monomers</w:t>
+            </w:r>
+          </w:p>
+        </w:tc>
+        <w:tc>
+          <w:tcPr>
+            <w:tcW w:type="dxa" w:w="5112"/>
+          </w:tcPr>
+          <w:p>
+            <w:pPr>
+              <w:spacing w:after="40"/>
+            </w:pPr>
+            <w:r>
+              <w:rPr>
+                <w:sz w:val="18"/>
+              </w:rPr>
+            </w:r>
+            <w:r>
+              <w:rPr>
+                <w:b w:val="0"/>
+                <w:i w:val="0"/>
+                <w:sz w:val="18"/>
+              </w:rPr>
+              <w:t>POSITIVE = thrombin activity, consistent with intravascular coagulation. NEGATIVE does NOT exclude it. Also positive in some severe liver disease and inflammatory disorders.</w:t>
+            </w:r>
+          </w:p>
+        </w:tc>
+      </w:tr>
+      <w:tr>
+        <w:tc>
+          <w:tcPr>
+            <w:tcW w:type="dxa" w:w="5112"/>
+            <w:shd w:val="clear" w:color="auto" w:fill="F1EEEF"/>
+          </w:tcPr>
+          <w:p>
+            <w:pPr>
+              <w:spacing w:after="40"/>
+            </w:pPr>
+            <w:r>
+              <w:rPr>
+                <w:b/>
+                <w:sz w:val="18"/>
+              </w:rPr>
+            </w:r>
+            <w:r>
+              <w:rPr>
+                <w:b/>
+                <w:i w:val="0"/>
+                <w:sz w:val="18"/>
+              </w:rPr>
+              <w:t>Clot vs breakdown</w:t>
+            </w:r>
+          </w:p>
+        </w:tc>
+        <w:tc>
+          <w:tcPr>
+            <w:tcW w:type="dxa" w:w="5112"/>
+          </w:tcPr>
+          <w:p>
+            <w:pPr>
+              <w:spacing w:after="40"/>
+            </w:pPr>
+            <w:r>
+              <w:rPr>
+                <w:sz w:val="18"/>
+              </w:rPr>
+            </w:r>
+            <w:r>
+              <w:rPr>
+                <w:b w:val="0"/>
+                <w:i w:val="0"/>
+                <w:sz w:val="18"/>
+              </w:rPr>
+              <w:t>Thrombin = clot generation; plasmin = clot breakdown.</w:t>
+            </w:r>
+          </w:p>
+        </w:tc>
+      </w:tr>
+      <w:tr>
+        <w:tc>
+          <w:tcPr>
+            <w:tcW w:type="dxa" w:w="5112"/>
+            <w:shd w:val="clear" w:color="auto" w:fill="F1EEEF"/>
+          </w:tcPr>
+          <w:p>
+            <w:pPr>
+              <w:spacing w:after="40"/>
+            </w:pPr>
+            <w:r>
+              <w:rPr>
+                <w:b/>
+                <w:sz w:val="18"/>
+              </w:rPr>
+            </w:r>
+            <w:r>
+              <w:rPr>
+                <w:b/>
+                <w:i w:val="0"/>
+                <w:sz w:val="18"/>
+              </w:rPr>
+              <w:t>Other fibrinolysis tests</w:t>
+            </w:r>
+          </w:p>
+        </w:tc>
+        <w:tc>
+          <w:tcPr>
+            <w:tcW w:type="dxa" w:w="5112"/>
+          </w:tcPr>
+          <w:p>
+            <w:pPr>
+              <w:spacing w:after="40"/>
+            </w:pPr>
+            <w:r>
+              <w:rPr>
+                <w:sz w:val="18"/>
+              </w:rPr>
+            </w:r>
+            <w:r>
+              <w:rPr>
+                <w:b w:val="0"/>
+                <w:i w:val="0"/>
+                <w:sz w:val="18"/>
+              </w:rPr>
+              <w:t>Euglobulin clot lysis time; alpha-2 antiplasmin and plasminogen activator inhibitor 1 assays.</w:t>
+            </w:r>
+          </w:p>
+        </w:tc>
+      </w:tr>
+    </w:tbl>
+    <w:p>
+      <w:pPr>
+        <w:spacing w:after="80"/>
+      </w:pPr>
+    </w:p>
+    <w:p>
+      <w:pPr>
+        <w:pStyle w:val="Heading1"/>
+        <w:spacing w:before="280" w:after="100"/>
+      </w:pPr>
+      <w:r>
+        <w:rPr>
+          <w:rFonts w:ascii="Georgia" w:hAnsi="Georgia"/>
+          <w:color w:val="17494B"/>
+        </w:rPr>
+        <w:t>Reading the Patterns</w:t>
+      </w:r>
+    </w:p>
+    <w:tbl>
+      <w:tblPr>
+        <w:tblStyle w:val="TableGrid"/>
+        <w:tblW w:type="auto" w:w="0"/>
+        <w:jc w:val="center"/>
+        <w:tblLook w:firstColumn="1" w:firstRow="1" w:lastColumn="0" w:lastRow="0" w:noHBand="0" w:noVBand="1" w:val="04A0"/>
+        <w:tblBorders>
+          <w:top w:val="single" w:sz="4" w:space="0" w:color="D8D2D4"/>
+          <w:left w:val="single" w:sz="4" w:space="0" w:color="D8D2D4"/>
+          <w:bottom w:val="single" w:sz="4" w:space="0" w:color="D8D2D4"/>
+          <w:right w:val="single" w:sz="4" w:space="0" w:color="D8D2D4"/>
+          <w:insideH w:val="single" w:sz="4" w:space="0" w:color="D8D2D4"/>
+          <w:insideV w:val="single" w:sz="4" w:space="0" w:color="D8D2D4"/>
+        </w:tblBorders>
+      </w:tblPr>
+      <w:tblGrid>
+        <w:gridCol w:w="5112"/>
+        <w:gridCol w:w="5112"/>
+      </w:tblGrid>
+      <w:tr>
+        <w:tc>
+          <w:tcPr>
+            <w:tcW w:type="dxa" w:w="5112"/>
+            <w:shd w:val="clear" w:color="auto" w:fill="17494B"/>
+          </w:tcPr>
+          <w:p>
+            <w:pPr>
+              <w:spacing w:after="40"/>
+            </w:pPr>
+            <w:r>
+              <w:rPr>
+                <w:b/>
+                <w:color w:val="FFFFFF"/>
+                <w:sz w:val="18"/>
+              </w:rPr>
+            </w:r>
+            <w:r>
+              <w:rPr>
+                <w:b/>
+                <w:i w:val="0"/>
+                <w:color w:val="FFFFFF"/>
+                <w:sz w:val="18"/>
+              </w:rPr>
+              <w:t>Term</w:t>
+            </w:r>
+          </w:p>
+        </w:tc>
+        <w:tc>
+          <w:tcPr>
+            <w:tcW w:type="dxa" w:w="5112"/>
+            <w:shd w:val="clear" w:color="auto" w:fill="17494B"/>
+          </w:tcPr>
+          <w:p>
+            <w:pPr>
+              <w:spacing w:after="40"/>
+            </w:pPr>
+            <w:r>
+              <w:rPr>
+                <w:b/>
+                <w:color w:val="FFFFFF"/>
+                <w:sz w:val="18"/>
+              </w:rPr>
+            </w:r>
+            <w:r>
+              <w:rPr>
+                <w:b/>
+                <w:i w:val="0"/>
+                <w:color w:val="FFFFFF"/>
+                <w:sz w:val="18"/>
+              </w:rPr>
+              <w:t>What you need to know</w:t>
+            </w:r>
+          </w:p>
+        </w:tc>
+      </w:tr>
+      <w:tr>
+        <w:tc>
+          <w:tcPr>
+            <w:tcW w:type="dxa" w:w="5112"/>
+            <w:shd w:val="clear" w:color="auto" w:fill="F1EEEF"/>
+          </w:tcPr>
+          <w:p>
+            <w:pPr>
+              <w:spacing w:after="40"/>
+            </w:pPr>
+            <w:r>
+              <w:rPr>
+                <w:b/>
+                <w:sz w:val="18"/>
+              </w:rPr>
+            </w:r>
+            <w:r>
+              <w:rPr>
+                <w:b/>
+                <w:i w:val="0"/>
+                <w:sz w:val="18"/>
+              </w:rPr>
+              <w:t>Start here</w:t>
+            </w:r>
+          </w:p>
+        </w:tc>
+        <w:tc>
+          <w:tcPr>
+            <w:tcW w:type="dxa" w:w="5112"/>
+          </w:tcPr>
+          <w:p>
+            <w:pPr>
+              <w:spacing w:after="40"/>
+            </w:pPr>
+            <w:r>
+              <w:rPr>
+                <w:sz w:val="18"/>
+              </w:rPr>
+            </w:r>
+            <w:r>
+              <w:rPr>
+                <w:b w:val="0"/>
+                <w:i w:val="0"/>
+                <w:sz w:val="18"/>
+              </w:rPr>
+              <w:t>Bleeding workup: blood count with smear, PT/INR, aPTT, fibrinogen. INTERPRET BY THE PT/aPTT PATTERN FIRST.</w:t>
+            </w:r>
+          </w:p>
+        </w:tc>
+      </w:tr>
+      <w:tr>
+        <w:tc>
+          <w:tcPr>
+            <w:tcW w:type="dxa" w:w="5112"/>
+            <w:shd w:val="clear" w:color="auto" w:fill="F1EEEF"/>
+          </w:tcPr>
+          <w:p>
+            <w:pPr>
+              <w:spacing w:after="40"/>
+            </w:pPr>
+            <w:r>
+              <w:rPr>
+                <w:b/>
+                <w:sz w:val="18"/>
+              </w:rPr>
+            </w:r>
+            <w:r>
+              <w:rPr>
+                <w:b/>
+                <w:i w:val="0"/>
+                <w:sz w:val="18"/>
+              </w:rPr>
+              <w:t>★ Where to begin</w:t>
+            </w:r>
+          </w:p>
+        </w:tc>
+        <w:tc>
+          <w:tcPr>
+            <w:tcW w:type="dxa" w:w="5112"/>
+          </w:tcPr>
+          <w:p>
+            <w:pPr>
+              <w:spacing w:after="40"/>
+            </w:pPr>
+            <w:r>
+              <w:rPr>
+                <w:sz w:val="18"/>
+              </w:rPr>
+            </w:r>
+            <w:r>
+              <w:rPr>
+                <w:b w:val="0"/>
+                <w:i w:val="0"/>
+                <w:sz w:val="18"/>
+              </w:rPr>
+              <w:t>An abnormal PTT means CLOTTING FACTORS (secondary hemostasis), never platelets. Normal PT and aPTT with bleeding means think PLATELETS (function, von Willebrand). Bleeding and clotting use the SAME tests; the INR places a patient on the clot-to-bleed spectrum.</w:t>
+            </w:r>
+          </w:p>
+        </w:tc>
+      </w:tr>
+      <w:tr>
+        <w:tc>
+          <w:tcPr>
+            <w:tcW w:type="dxa" w:w="5112"/>
+            <w:shd w:val="clear" w:color="auto" w:fill="F1EEEF"/>
+          </w:tcPr>
+          <w:p>
+            <w:pPr>
+              <w:spacing w:after="40"/>
+            </w:pPr>
+            <w:r>
+              <w:rPr>
+                <w:b/>
+                <w:sz w:val="18"/>
+              </w:rPr>
+            </w:r>
+            <w:r>
+              <w:rPr>
+                <w:b/>
+                <w:i w:val="0"/>
+                <w:sz w:val="18"/>
+              </w:rPr>
+              <w:t>PT up, aPTT normal</w:t>
+            </w:r>
+          </w:p>
+        </w:tc>
+        <w:tc>
+          <w:tcPr>
+            <w:tcW w:type="dxa" w:w="5112"/>
+          </w:tcPr>
+          <w:p>
+            <w:pPr>
+              <w:spacing w:after="40"/>
+            </w:pPr>
+            <w:r>
+              <w:rPr>
+                <w:sz w:val="18"/>
+              </w:rPr>
+            </w:r>
+            <w:r>
+              <w:rPr>
+                <w:b w:val="0"/>
+                <w:i w:val="0"/>
+                <w:sz w:val="18"/>
+              </w:rPr>
+              <w:t>Factor VII, early vitamin K deficiency, liver disease, warfarin (or oral factor Xa inhibitor).</w:t>
+            </w:r>
+          </w:p>
+        </w:tc>
+      </w:tr>
+      <w:tr>
+        <w:tc>
+          <w:tcPr>
+            <w:tcW w:type="dxa" w:w="5112"/>
+            <w:shd w:val="clear" w:color="auto" w:fill="F1EEEF"/>
+          </w:tcPr>
+          <w:p>
+            <w:pPr>
+              <w:spacing w:after="40"/>
+            </w:pPr>
+            <w:r>
+              <w:rPr>
+                <w:b/>
+                <w:sz w:val="18"/>
+              </w:rPr>
+            </w:r>
+            <w:r>
+              <w:rPr>
+                <w:b/>
+                <w:i w:val="0"/>
+                <w:sz w:val="18"/>
+              </w:rPr>
+              <w:t>PT normal, aPTT up</w:t>
+            </w:r>
+          </w:p>
+        </w:tc>
+        <w:tc>
+          <w:tcPr>
+            <w:tcW w:type="dxa" w:w="5112"/>
+          </w:tcPr>
+          <w:p>
+            <w:pPr>
+              <w:spacing w:after="40"/>
+            </w:pPr>
+            <w:r>
+              <w:rPr>
+                <w:sz w:val="18"/>
+              </w:rPr>
+            </w:r>
+            <w:r>
+              <w:rPr>
+                <w:b w:val="0"/>
+                <w:i w:val="0"/>
+                <w:sz w:val="18"/>
+              </w:rPr>
+              <w:t>Intrinsic: VIII, IX, XI; von Willebrand disease; heparin or dabigatran (thrombin time up too); inhibitor; LUPUS ANTICOAGULANT or FACTOR XII (no bleeding history).</w:t>
+            </w:r>
+          </w:p>
+        </w:tc>
+      </w:tr>
+      <w:tr>
+        <w:tc>
+          <w:tcPr>
+            <w:tcW w:type="dxa" w:w="5112"/>
+            <w:shd w:val="clear" w:color="auto" w:fill="F1EEEF"/>
+          </w:tcPr>
+          <w:p>
+            <w:pPr>
+              <w:spacing w:after="40"/>
+            </w:pPr>
+            <w:r>
+              <w:rPr>
+                <w:b/>
+                <w:sz w:val="18"/>
+              </w:rPr>
+            </w:r>
+            <w:r>
+              <w:rPr>
+                <w:b/>
+                <w:i w:val="0"/>
+                <w:sz w:val="18"/>
+              </w:rPr>
+              <w:t>PT up AND aPTT up</w:t>
+            </w:r>
+          </w:p>
+        </w:tc>
+        <w:tc>
+          <w:tcPr>
+            <w:tcW w:type="dxa" w:w="5112"/>
+          </w:tcPr>
+          <w:p>
+            <w:pPr>
+              <w:spacing w:after="40"/>
+            </w:pPr>
+            <w:r>
+              <w:rPr>
+                <w:sz w:val="18"/>
+              </w:rPr>
+            </w:r>
+            <w:r>
+              <w:rPr>
+                <w:b w:val="0"/>
+                <w:i w:val="0"/>
+                <w:sz w:val="18"/>
+              </w:rPr>
+              <w:t>Common pathway or combined deficiency, DIC, liver disease, severe vitamin K deficiency. Normal thrombin time = X, V, II; prolonged = fibrinogen problem.</w:t>
+            </w:r>
+          </w:p>
+        </w:tc>
+      </w:tr>
+      <w:tr>
+        <w:tc>
+          <w:tcPr>
+            <w:tcW w:type="dxa" w:w="5112"/>
+            <w:shd w:val="clear" w:color="auto" w:fill="F1EEEF"/>
+          </w:tcPr>
+          <w:p>
+            <w:pPr>
+              <w:spacing w:after="40"/>
+            </w:pPr>
+            <w:r>
+              <w:rPr>
+                <w:b/>
+                <w:sz w:val="18"/>
+              </w:rPr>
+            </w:r>
+            <w:r>
+              <w:rPr>
+                <w:b/>
+                <w:i w:val="0"/>
+                <w:sz w:val="18"/>
+              </w:rPr>
+              <w:t>★ Normal PT AND aPTT, yet bleeding</w:t>
+            </w:r>
+          </w:p>
+        </w:tc>
+        <w:tc>
+          <w:tcPr>
+            <w:tcW w:type="dxa" w:w="5112"/>
+          </w:tcPr>
+          <w:p>
+            <w:pPr>
+              <w:spacing w:after="40"/>
+            </w:pPr>
+            <w:r>
+              <w:rPr>
+                <w:sz w:val="18"/>
+              </w:rPr>
+            </w:r>
+            <w:r>
+              <w:rPr>
+                <w:b w:val="0"/>
+                <w:i w:val="0"/>
+                <w:sz w:val="18"/>
+              </w:rPr>
+              <w:t>Platelet disorder, mild von Willebrand disease, factor XIII or alpha-2 antiplasmin deficiency, impaired fibrinolysis.</w:t>
+            </w:r>
+          </w:p>
+        </w:tc>
+      </w:tr>
+      <w:tr>
+        <w:tc>
+          <w:tcPr>
+            <w:tcW w:type="dxa" w:w="5112"/>
+            <w:shd w:val="clear" w:color="auto" w:fill="F1EEEF"/>
+          </w:tcPr>
+          <w:p>
+            <w:pPr>
+              <w:spacing w:after="40"/>
+            </w:pPr>
+            <w:r>
+              <w:rPr>
+                <w:b/>
+                <w:sz w:val="18"/>
+              </w:rPr>
+            </w:r>
+            <w:r>
+              <w:rPr>
+                <w:b/>
+                <w:i w:val="0"/>
+                <w:sz w:val="18"/>
+              </w:rPr>
+              <w:t>★ DIC pattern</w:t>
+            </w:r>
+          </w:p>
+        </w:tc>
+        <w:tc>
+          <w:tcPr>
+            <w:tcW w:type="dxa" w:w="5112"/>
+          </w:tcPr>
+          <w:p>
+            <w:pPr>
+              <w:spacing w:after="40"/>
+            </w:pPr>
+            <w:r>
+              <w:rPr>
+                <w:sz w:val="18"/>
+              </w:rPr>
+            </w:r>
+            <w:r>
+              <w:rPr>
+                <w:b w:val="0"/>
+                <w:i w:val="0"/>
+                <w:sz w:val="18"/>
+              </w:rPr>
+              <w:t>PT up, aPTT up, fibrinogen DOWN, D-dimer UP, platelets DOWN. Protease inhibitors (protein C, antithrombin, protein S) DOWN. Every abnormality has other causes; the PATTERN matters.</w:t>
+            </w:r>
+          </w:p>
+        </w:tc>
+      </w:tr>
+      <w:tr>
+        <w:tc>
+          <w:tcPr>
+            <w:tcW w:type="dxa" w:w="5112"/>
+            <w:shd w:val="clear" w:color="auto" w:fill="F1EEEF"/>
+          </w:tcPr>
+          <w:p>
+            <w:pPr>
+              <w:spacing w:after="40"/>
+            </w:pPr>
+            <w:r>
+              <w:rPr>
+                <w:b/>
+                <w:sz w:val="18"/>
+              </w:rPr>
+            </w:r>
+            <w:r>
+              <w:rPr>
+                <w:b/>
+                <w:i w:val="0"/>
+                <w:sz w:val="18"/>
+              </w:rPr>
+              <w:t>Acute thrombosis pattern</w:t>
+            </w:r>
+          </w:p>
+        </w:tc>
+        <w:tc>
+          <w:tcPr>
+            <w:tcW w:type="dxa" w:w="5112"/>
+          </w:tcPr>
+          <w:p>
+            <w:pPr>
+              <w:spacing w:after="40"/>
+            </w:pPr>
+            <w:r>
+              <w:rPr>
+                <w:sz w:val="18"/>
+              </w:rPr>
+            </w:r>
+            <w:r>
+              <w:rPr>
+                <w:b w:val="0"/>
+                <w:i w:val="0"/>
+                <w:sz w:val="18"/>
+              </w:rPr>
+              <w:t>ONLY the D-dimer is up (nonspecific); PT, aPTT, fibrinogen, platelets normal.</w:t>
+            </w:r>
+          </w:p>
+        </w:tc>
+      </w:tr>
+      <w:tr>
+        <w:tc>
+          <w:tcPr>
+            <w:tcW w:type="dxa" w:w="5112"/>
+            <w:shd w:val="clear" w:color="auto" w:fill="F1EEEF"/>
+          </w:tcPr>
+          <w:p>
+            <w:pPr>
+              <w:spacing w:after="40"/>
+            </w:pPr>
+            <w:r>
+              <w:rPr>
+                <w:b/>
+                <w:sz w:val="18"/>
+              </w:rPr>
+            </w:r>
+            <w:r>
+              <w:rPr>
+                <w:b/>
+                <w:i w:val="0"/>
+                <w:sz w:val="18"/>
+              </w:rPr>
+              <w:t>Factor XII</w:t>
+            </w:r>
+          </w:p>
+        </w:tc>
+        <w:tc>
+          <w:tcPr>
+            <w:tcW w:type="dxa" w:w="5112"/>
+          </w:tcPr>
+          <w:p>
+            <w:pPr>
+              <w:spacing w:after="40"/>
+            </w:pPr>
+            <w:r>
+              <w:rPr>
+                <w:sz w:val="18"/>
+              </w:rPr>
+            </w:r>
+            <w:r>
+              <w:rPr>
+                <w:b w:val="0"/>
+                <w:i w:val="0"/>
+                <w:sz w:val="18"/>
+              </w:rPr>
+              <w:t>Prolongs the aPTT but does NOT cause bleeding.</w:t>
+            </w:r>
+          </w:p>
+        </w:tc>
+      </w:tr>
+      <w:tr>
+        <w:tc>
+          <w:tcPr>
+            <w:tcW w:type="dxa" w:w="5112"/>
+            <w:shd w:val="clear" w:color="auto" w:fill="F1EEEF"/>
+          </w:tcPr>
+          <w:p>
+            <w:pPr>
+              <w:spacing w:after="40"/>
+            </w:pPr>
+            <w:r>
+              <w:rPr>
+                <w:b/>
+                <w:sz w:val="18"/>
+              </w:rPr>
+            </w:r>
+            <w:r>
+              <w:rPr>
+                <w:b/>
+                <w:i w:val="0"/>
+                <w:sz w:val="18"/>
+              </w:rPr>
+              <w:t>★ Isolated long aPTT</w:t>
+            </w:r>
+          </w:p>
+        </w:tc>
+        <w:tc>
+          <w:tcPr>
+            <w:tcW w:type="dxa" w:w="5112"/>
+          </w:tcPr>
+          <w:p>
+            <w:pPr>
+              <w:spacing w:after="40"/>
+            </w:pPr>
+            <w:r>
+              <w:rPr>
+                <w:sz w:val="18"/>
+              </w:rPr>
+            </w:r>
+            <w:r>
+              <w:rPr>
+                <w:b w:val="0"/>
+                <w:i w:val="0"/>
+                <w:sz w:val="18"/>
+              </w:rPr>
+              <w:t>Rule out HEPARIN first, then fibrinogen. Corrects on mixing = factor deficiency: low VIII, then von Willebrand studies (abnormal = von Willebrand disease, normal = HEMOPHILIA). Does not correct = inhibitor: phospholipid-dependent = LUPUS ANTICOAGULANT (dilute Russell viper venom time).</w:t>
+            </w:r>
+          </w:p>
+        </w:tc>
+      </w:tr>
+      <w:tr>
+        <w:tc>
+          <w:tcPr>
+            <w:tcW w:type="dxa" w:w="5112"/>
+            <w:shd w:val="clear" w:color="auto" w:fill="F1EEEF"/>
+          </w:tcPr>
+          <w:p>
+            <w:pPr>
+              <w:spacing w:after="40"/>
+            </w:pPr>
+            <w:r>
+              <w:rPr>
+                <w:b/>
+                <w:sz w:val="18"/>
+              </w:rPr>
+            </w:r>
+            <w:r>
+              <w:rPr>
+                <w:b/>
+                <w:i w:val="0"/>
+                <w:sz w:val="18"/>
+              </w:rPr>
+              <w:t>Reptilase time</w:t>
+            </w:r>
+          </w:p>
+        </w:tc>
+        <w:tc>
+          <w:tcPr>
+            <w:tcW w:type="dxa" w:w="5112"/>
+          </w:tcPr>
+          <w:p>
+            <w:pPr>
+              <w:spacing w:after="40"/>
+            </w:pPr>
+            <w:r>
+              <w:rPr>
+                <w:sz w:val="18"/>
+              </w:rPr>
+            </w:r>
+            <w:r>
+              <w:rPr>
+                <w:b w:val="0"/>
+                <w:i w:val="0"/>
+                <w:sz w:val="18"/>
+              </w:rPr>
+              <w:t>Normal with heparin; assesses FIBRINOGEN function.</w:t>
+            </w:r>
+          </w:p>
+        </w:tc>
+      </w:tr>
+    </w:tbl>
+    <w:p>
+      <w:pPr>
+        <w:spacing w:after="80"/>
+      </w:pPr>
+    </w:p>
+    <w:p>
+      <w:pPr>
+        <w:pStyle w:val="Heading1"/>
+        <w:spacing w:before="280" w:after="100"/>
+      </w:pPr>
+      <w:r>
+        <w:rPr>
+          <w:rFonts w:ascii="Georgia" w:hAnsi="Georgia"/>
+          <w:color w:val="17494B"/>
+        </w:rPr>
+        <w:t>Platelet Abnormalities</w:t>
+      </w:r>
+    </w:p>
+    <w:tbl>
+      <w:tblPr>
+        <w:tblStyle w:val="TableGrid"/>
+        <w:tblW w:type="auto" w:w="0"/>
+        <w:jc w:val="center"/>
+        <w:tblLook w:firstColumn="1" w:firstRow="1" w:lastColumn="0" w:lastRow="0" w:noHBand="0" w:noVBand="1" w:val="04A0"/>
+        <w:tblBorders>
+          <w:top w:val="single" w:sz="4" w:space="0" w:color="D8D2D4"/>
+          <w:left w:val="single" w:sz="4" w:space="0" w:color="D8D2D4"/>
+          <w:bottom w:val="single" w:sz="4" w:space="0" w:color="D8D2D4"/>
+          <w:right w:val="single" w:sz="4" w:space="0" w:color="D8D2D4"/>
+          <w:insideH w:val="single" w:sz="4" w:space="0" w:color="D8D2D4"/>
+          <w:insideV w:val="single" w:sz="4" w:space="0" w:color="D8D2D4"/>
+        </w:tblBorders>
+      </w:tblPr>
+      <w:tblGrid>
+        <w:gridCol w:w="5112"/>
+        <w:gridCol w:w="5112"/>
+      </w:tblGrid>
+      <w:tr>
+        <w:tc>
+          <w:tcPr>
+            <w:tcW w:type="dxa" w:w="5112"/>
+            <w:shd w:val="clear" w:color="auto" w:fill="17494B"/>
+          </w:tcPr>
+          <w:p>
+            <w:pPr>
+              <w:spacing w:after="40"/>
+            </w:pPr>
+            <w:r>
+              <w:rPr>
+                <w:b/>
+                <w:color w:val="FFFFFF"/>
+                <w:sz w:val="18"/>
+              </w:rPr>
+            </w:r>
+            <w:r>
+              <w:rPr>
+                <w:b/>
+                <w:i w:val="0"/>
+                <w:color w:val="FFFFFF"/>
+                <w:sz w:val="18"/>
+              </w:rPr>
+              <w:t>Term</w:t>
+            </w:r>
+          </w:p>
+        </w:tc>
+        <w:tc>
+          <w:tcPr>
+            <w:tcW w:type="dxa" w:w="5112"/>
+            <w:shd w:val="clear" w:color="auto" w:fill="17494B"/>
+          </w:tcPr>
+          <w:p>
+            <w:pPr>
+              <w:spacing w:after="40"/>
+            </w:pPr>
+            <w:r>
+              <w:rPr>
+                <w:b/>
+                <w:color w:val="FFFFFF"/>
+                <w:sz w:val="18"/>
+              </w:rPr>
+            </w:r>
+            <w:r>
+              <w:rPr>
+                <w:b/>
+                <w:i w:val="0"/>
+                <w:color w:val="FFFFFF"/>
+                <w:sz w:val="18"/>
+              </w:rPr>
+              <w:t>What you need to know</w:t>
+            </w:r>
+          </w:p>
+        </w:tc>
+      </w:tr>
+      <w:tr>
+        <w:tc>
+          <w:tcPr>
+            <w:tcW w:type="dxa" w:w="5112"/>
+            <w:shd w:val="clear" w:color="auto" w:fill="F1EEEF"/>
+          </w:tcPr>
+          <w:p>
+            <w:pPr>
+              <w:spacing w:after="40"/>
+            </w:pPr>
+            <w:r>
+              <w:rPr>
+                <w:b/>
+                <w:sz w:val="18"/>
+              </w:rPr>
+            </w:r>
+            <w:r>
+              <w:rPr>
+                <w:b/>
+                <w:i w:val="0"/>
+                <w:sz w:val="18"/>
+              </w:rPr>
+              <w:t>★ Bleeding tiers</w:t>
+            </w:r>
+          </w:p>
+        </w:tc>
+        <w:tc>
+          <w:tcPr>
+            <w:tcW w:type="dxa" w:w="5112"/>
+          </w:tcPr>
+          <w:p>
+            <w:pPr>
+              <w:spacing w:after="40"/>
+            </w:pPr>
+            <w:r>
+              <w:rPr>
+                <w:sz w:val="18"/>
+              </w:rPr>
+            </w:r>
+            <w:r>
+              <w:rPr>
+                <w:b w:val="0"/>
+                <w:i w:val="0"/>
+                <w:sz w:val="18"/>
+              </w:rPr>
+              <w:t>Below 50,000: bruises easily, bleeds with trauma or mucosal surgery. Below 20,000: SPONTANEOUS bleeding, PETECHIAE. Below 10,000: spontaneous INTRACRANIAL bleeding.</w:t>
+            </w:r>
+          </w:p>
+        </w:tc>
+      </w:tr>
+      <w:tr>
+        <w:tc>
+          <w:tcPr>
+            <w:tcW w:type="dxa" w:w="5112"/>
+            <w:shd w:val="clear" w:color="auto" w:fill="F1EEEF"/>
+          </w:tcPr>
+          <w:p>
+            <w:pPr>
+              <w:spacing w:after="40"/>
+            </w:pPr>
+            <w:r>
+              <w:rPr>
+                <w:b/>
+                <w:sz w:val="18"/>
+              </w:rPr>
+            </w:r>
+            <w:r>
+              <w:rPr>
+                <w:b/>
+                <w:i w:val="0"/>
+                <w:sz w:val="18"/>
+              </w:rPr>
+              <w:t>Quantitative</w:t>
+            </w:r>
+          </w:p>
+        </w:tc>
+        <w:tc>
+          <w:tcPr>
+            <w:tcW w:type="dxa" w:w="5112"/>
+          </w:tcPr>
+          <w:p>
+            <w:pPr>
+              <w:spacing w:after="40"/>
+            </w:pPr>
+            <w:r>
+              <w:rPr>
+                <w:sz w:val="18"/>
+              </w:rPr>
+            </w:r>
+            <w:r>
+              <w:rPr>
+                <w:b w:val="0"/>
+                <w:i w:val="0"/>
+                <w:sz w:val="18"/>
+              </w:rPr>
+              <w:t>Thrombocytopenia AND extreme thrombocythemia (above 1,000 × 10⁹ per liter) can BOTH bleed.</w:t>
+            </w:r>
+          </w:p>
+        </w:tc>
+      </w:tr>
+      <w:tr>
+        <w:tc>
+          <w:tcPr>
+            <w:tcW w:type="dxa" w:w="5112"/>
+            <w:shd w:val="clear" w:color="auto" w:fill="F1EEEF"/>
+          </w:tcPr>
+          <w:p>
+            <w:pPr>
+              <w:spacing w:after="40"/>
+            </w:pPr>
+            <w:r>
+              <w:rPr>
+                <w:b/>
+                <w:sz w:val="18"/>
+              </w:rPr>
+            </w:r>
+            <w:r>
+              <w:rPr>
+                <w:b/>
+                <w:i w:val="0"/>
+                <w:sz w:val="18"/>
+              </w:rPr>
+              <w:t>Morphology</w:t>
+            </w:r>
+          </w:p>
+        </w:tc>
+        <w:tc>
+          <w:tcPr>
+            <w:tcW w:type="dxa" w:w="5112"/>
+          </w:tcPr>
+          <w:p>
+            <w:pPr>
+              <w:spacing w:after="40"/>
+            </w:pPr>
+            <w:r>
+              <w:rPr>
+                <w:sz w:val="18"/>
+              </w:rPr>
+            </w:r>
+            <w:r>
+              <w:rPr>
+                <w:b w:val="0"/>
+                <w:i w:val="0"/>
+                <w:sz w:val="18"/>
+              </w:rPr>
+              <w:t>Gray platelets = gray platelet syndrome; neutrophil inclusions = May-Hegglin; clumps = spurious low count; fragmented red cells (schistocytes) = thrombotic thrombocytopenic purpura.</w:t>
+            </w:r>
+          </w:p>
+        </w:tc>
+      </w:tr>
+      <w:tr>
+        <w:tc>
+          <w:tcPr>
+            <w:tcW w:type="dxa" w:w="5112"/>
+            <w:shd w:val="clear" w:color="auto" w:fill="F1EEEF"/>
+          </w:tcPr>
+          <w:p>
+            <w:pPr>
+              <w:spacing w:after="40"/>
+            </w:pPr>
+            <w:r>
+              <w:rPr>
+                <w:b/>
+                <w:sz w:val="18"/>
+              </w:rPr>
+            </w:r>
+            <w:r>
+              <w:rPr>
+                <w:b/>
+                <w:i w:val="0"/>
+                <w:sz w:val="18"/>
+              </w:rPr>
+              <w:t>★ Qualitative</w:t>
+            </w:r>
+          </w:p>
+        </w:tc>
+        <w:tc>
+          <w:tcPr>
+            <w:tcW w:type="dxa" w:w="5112"/>
+          </w:tcPr>
+          <w:p>
+            <w:pPr>
+              <w:spacing w:after="40"/>
+            </w:pPr>
+            <w:r>
+              <w:rPr>
+                <w:sz w:val="18"/>
+              </w:rPr>
+            </w:r>
+            <w:r>
+              <w:rPr>
+                <w:b w:val="0"/>
+                <w:i w:val="0"/>
+                <w:sz w:val="18"/>
+              </w:rPr>
+              <w:t>Normal PT and aPTT WITH bleeding = platelet dysfunction: von Willebrand types 2 and 3, uremia, drugs (aspirin).</w:t>
+            </w:r>
+          </w:p>
+        </w:tc>
+      </w:tr>
+      <w:tr>
+        <w:tc>
+          <w:tcPr>
+            <w:tcW w:type="dxa" w:w="5112"/>
+            <w:shd w:val="clear" w:color="auto" w:fill="F1EEEF"/>
+          </w:tcPr>
+          <w:p>
+            <w:pPr>
+              <w:spacing w:after="40"/>
+            </w:pPr>
+            <w:r>
+              <w:rPr>
+                <w:b/>
+                <w:sz w:val="18"/>
+              </w:rPr>
+            </w:r>
+            <w:r>
+              <w:rPr>
+                <w:b/>
+                <w:i w:val="0"/>
+                <w:sz w:val="18"/>
+              </w:rPr>
+              <w:t>Low count, normal clotting times</w:t>
+            </w:r>
+          </w:p>
+        </w:tc>
+        <w:tc>
+          <w:tcPr>
+            <w:tcW w:type="dxa" w:w="5112"/>
+          </w:tcPr>
+          <w:p>
+            <w:pPr>
+              <w:spacing w:after="40"/>
+            </w:pPr>
+            <w:r>
+              <w:rPr>
+                <w:sz w:val="18"/>
+              </w:rPr>
+            </w:r>
+            <w:r>
+              <w:rPr>
+                <w:b w:val="0"/>
+                <w:i w:val="0"/>
+                <w:sz w:val="18"/>
+              </w:rPr>
+              <w:t>Immune thrombocytopenia, thrombotic thrombocytopenic purpura, hemolytic uremic syndrome, heparin-induced thrombocytopenia (normal PT, aPTT, platelet function analysis).</w:t>
+            </w:r>
+          </w:p>
+        </w:tc>
+      </w:tr>
+      <w:tr>
+        <w:tc>
+          <w:tcPr>
+            <w:tcW w:type="dxa" w:w="5112"/>
+            <w:shd w:val="clear" w:color="auto" w:fill="F1EEEF"/>
+          </w:tcPr>
+          <w:p>
+            <w:pPr>
+              <w:spacing w:after="40"/>
+            </w:pPr>
+            <w:r>
+              <w:rPr>
+                <w:b/>
+                <w:sz w:val="18"/>
+              </w:rPr>
+            </w:r>
+            <w:r>
+              <w:rPr>
+                <w:b/>
+                <w:i w:val="0"/>
+                <w:sz w:val="18"/>
+              </w:rPr>
+              <w:t>Platelet function analysis abnormal</w:t>
+            </w:r>
+          </w:p>
+        </w:tc>
+        <w:tc>
+          <w:tcPr>
+            <w:tcW w:type="dxa" w:w="5112"/>
+          </w:tcPr>
+          <w:p>
+            <w:pPr>
+              <w:spacing w:after="40"/>
+            </w:pPr>
+            <w:r>
+              <w:rPr>
+                <w:sz w:val="18"/>
+              </w:rPr>
+            </w:r>
+            <w:r>
+              <w:rPr>
+                <w:b w:val="0"/>
+                <w:i w:val="0"/>
+                <w:sz w:val="18"/>
+              </w:rPr>
+              <w:t>von Willebrand disease, DIC, uremia, aspirin and other nonsteroidal anti-inflammatory drugs, late liver failure. NORMAL in hemophilia A or B.</w:t>
+            </w:r>
+          </w:p>
+        </w:tc>
+      </w:tr>
+      <w:tr>
+        <w:tc>
+          <w:tcPr>
+            <w:tcW w:type="dxa" w:w="5112"/>
+            <w:shd w:val="clear" w:color="auto" w:fill="F1EEEF"/>
+          </w:tcPr>
+          <w:p>
+            <w:pPr>
+              <w:spacing w:after="40"/>
+            </w:pPr>
+            <w:r>
+              <w:rPr>
+                <w:b/>
+                <w:sz w:val="18"/>
+              </w:rPr>
+            </w:r>
+            <w:r>
+              <w:rPr>
+                <w:b/>
+                <w:i w:val="0"/>
+                <w:sz w:val="18"/>
+              </w:rPr>
+              <w:t>Low count: causes</w:t>
+            </w:r>
+          </w:p>
+        </w:tc>
+        <w:tc>
+          <w:tcPr>
+            <w:tcW w:type="dxa" w:w="5112"/>
+          </w:tcPr>
+          <w:p>
+            <w:pPr>
+              <w:spacing w:after="40"/>
+            </w:pPr>
+            <w:r>
+              <w:rPr>
+                <w:sz w:val="18"/>
+              </w:rPr>
+            </w:r>
+            <w:r>
+              <w:rPr>
+                <w:b w:val="0"/>
+                <w:i w:val="0"/>
+                <w:sz w:val="18"/>
+              </w:rPr>
+              <w:t>Impaired production · increased destruction (immune, microangiopathy, CONSUMPTION in DIC) · dilution (massive transfusion) · SEQUESTRATION (hypersplenism).</w:t>
+            </w:r>
+          </w:p>
+        </w:tc>
+      </w:tr>
+    </w:tbl>
+    <w:p>
+      <w:pPr>
+        <w:spacing w:after="80"/>
+      </w:pPr>
+    </w:p>
+    <w:p>
+      <w:pPr>
+        <w:pStyle w:val="Heading1"/>
+        <w:spacing w:before="280" w:after="100"/>
+      </w:pPr>
+      <w:r>
+        <w:rPr>
+          <w:rFonts w:ascii="Georgia" w:hAnsi="Georgia"/>
+          <w:color w:val="17494B"/>
+        </w:rPr>
+        <w:t>Indications &amp; the Two Workups</w:t>
+      </w:r>
+    </w:p>
+    <w:tbl>
+      <w:tblPr>
+        <w:tblStyle w:val="TableGrid"/>
+        <w:tblW w:type="auto" w:w="0"/>
+        <w:jc w:val="center"/>
+        <w:tblLook w:firstColumn="1" w:firstRow="1" w:lastColumn="0" w:lastRow="0" w:noHBand="0" w:noVBand="1" w:val="04A0"/>
+        <w:tblBorders>
+          <w:top w:val="single" w:sz="4" w:space="0" w:color="D8D2D4"/>
+          <w:left w:val="single" w:sz="4" w:space="0" w:color="D8D2D4"/>
+          <w:bottom w:val="single" w:sz="4" w:space="0" w:color="D8D2D4"/>
+          <w:right w:val="single" w:sz="4" w:space="0" w:color="D8D2D4"/>
+          <w:insideH w:val="single" w:sz="4" w:space="0" w:color="D8D2D4"/>
+          <w:insideV w:val="single" w:sz="4" w:space="0" w:color="D8D2D4"/>
+        </w:tblBorders>
+      </w:tblPr>
+      <w:tblGrid>
+        <w:gridCol w:w="5112"/>
+        <w:gridCol w:w="5112"/>
+      </w:tblGrid>
+      <w:tr>
+        <w:tc>
+          <w:tcPr>
+            <w:tcW w:type="dxa" w:w="5112"/>
+            <w:shd w:val="clear" w:color="auto" w:fill="17494B"/>
+          </w:tcPr>
+          <w:p>
+            <w:pPr>
+              <w:spacing w:after="40"/>
+            </w:pPr>
+            <w:r>
+              <w:rPr>
+                <w:b/>
+                <w:color w:val="FFFFFF"/>
+                <w:sz w:val="18"/>
+              </w:rPr>
+            </w:r>
+            <w:r>
+              <w:rPr>
+                <w:b/>
+                <w:i w:val="0"/>
+                <w:color w:val="FFFFFF"/>
+                <w:sz w:val="18"/>
+              </w:rPr>
+              <w:t>Term</w:t>
+            </w:r>
+          </w:p>
+        </w:tc>
+        <w:tc>
+          <w:tcPr>
+            <w:tcW w:type="dxa" w:w="5112"/>
+            <w:shd w:val="clear" w:color="auto" w:fill="17494B"/>
+          </w:tcPr>
+          <w:p>
+            <w:pPr>
+              <w:spacing w:after="40"/>
+            </w:pPr>
+            <w:r>
+              <w:rPr>
+                <w:b/>
+                <w:color w:val="FFFFFF"/>
+                <w:sz w:val="18"/>
+              </w:rPr>
+            </w:r>
+            <w:r>
+              <w:rPr>
+                <w:b/>
+                <w:i w:val="0"/>
+                <w:color w:val="FFFFFF"/>
+                <w:sz w:val="18"/>
+              </w:rPr>
+              <w:t>What you need to know</w:t>
+            </w:r>
+          </w:p>
+        </w:tc>
+      </w:tr>
+      <w:tr>
+        <w:tc>
+          <w:tcPr>
+            <w:tcW w:type="dxa" w:w="5112"/>
+            <w:shd w:val="clear" w:color="auto" w:fill="F1EEEF"/>
+          </w:tcPr>
+          <w:p>
+            <w:pPr>
+              <w:spacing w:after="40"/>
+            </w:pPr>
+            <w:r>
+              <w:rPr>
+                <w:b/>
+                <w:sz w:val="18"/>
+              </w:rPr>
+            </w:r>
+            <w:r>
+              <w:rPr>
+                <w:b/>
+                <w:i w:val="0"/>
+                <w:sz w:val="18"/>
+              </w:rPr>
+              <w:t>Indications</w:t>
+            </w:r>
+          </w:p>
+        </w:tc>
+        <w:tc>
+          <w:tcPr>
+            <w:tcW w:type="dxa" w:w="5112"/>
+          </w:tcPr>
+          <w:p>
+            <w:pPr>
+              <w:spacing w:after="40"/>
+            </w:pPr>
+            <w:r>
+              <w:rPr>
+                <w:sz w:val="18"/>
+              </w:rPr>
+            </w:r>
+            <w:r>
+              <w:rPr>
+                <w:b w:val="0"/>
+                <w:i w:val="0"/>
+                <w:sz w:val="18"/>
+              </w:rPr>
+              <w:t>Symptomatic bleeding; preprocedural risk (but mild prolongation does not predict bleeding); WARFARIN monitoring; DIC, liver disease, vitamin K deficiency; suspected thrombosis (D-dimer to rule OUT).</w:t>
+            </w:r>
+          </w:p>
+        </w:tc>
+      </w:tr>
+      <w:tr>
+        <w:tc>
+          <w:tcPr>
+            <w:tcW w:type="dxa" w:w="5112"/>
+            <w:shd w:val="clear" w:color="auto" w:fill="F1EEEF"/>
+          </w:tcPr>
+          <w:p>
+            <w:pPr>
+              <w:spacing w:after="40"/>
+            </w:pPr>
+            <w:r>
+              <w:rPr>
+                <w:b/>
+                <w:sz w:val="18"/>
+              </w:rPr>
+            </w:r>
+            <w:r>
+              <w:rPr>
+                <w:b/>
+                <w:i w:val="0"/>
+                <w:sz w:val="18"/>
+              </w:rPr>
+              <w:t>Five screening tests</w:t>
+            </w:r>
+          </w:p>
+        </w:tc>
+        <w:tc>
+          <w:tcPr>
+            <w:tcW w:type="dxa" w:w="5112"/>
+          </w:tcPr>
+          <w:p>
+            <w:pPr>
+              <w:spacing w:after="40"/>
+            </w:pPr>
+            <w:r>
+              <w:rPr>
+                <w:sz w:val="18"/>
+              </w:rPr>
+            </w:r>
+            <w:r>
+              <w:rPr>
+                <w:b w:val="0"/>
+                <w:i w:val="0"/>
+                <w:sz w:val="18"/>
+              </w:rPr>
+              <w:t>Platelet count/size/shape, bleeding time, aPTT, PT, fibrinogen. Then factor assays and fibrinolysis tests.</w:t>
+            </w:r>
+          </w:p>
+        </w:tc>
+      </w:tr>
+      <w:tr>
+        <w:tc>
+          <w:tcPr>
+            <w:tcW w:type="dxa" w:w="5112"/>
+            <w:shd w:val="clear" w:color="auto" w:fill="F1EEEF"/>
+          </w:tcPr>
+          <w:p>
+            <w:pPr>
+              <w:spacing w:after="40"/>
+            </w:pPr>
+            <w:r>
+              <w:rPr>
+                <w:b/>
+                <w:sz w:val="18"/>
+              </w:rPr>
+            </w:r>
+            <w:r>
+              <w:rPr>
+                <w:b/>
+                <w:i w:val="0"/>
+                <w:sz w:val="18"/>
+              </w:rPr>
+              <w:t>Bleeding workup</w:t>
+            </w:r>
+          </w:p>
+        </w:tc>
+        <w:tc>
+          <w:tcPr>
+            <w:tcW w:type="dxa" w:w="5112"/>
+          </w:tcPr>
+          <w:p>
+            <w:pPr>
+              <w:spacing w:after="40"/>
+            </w:pPr>
+            <w:r>
+              <w:rPr>
+                <w:sz w:val="18"/>
+              </w:rPr>
+            </w:r>
+            <w:r>
+              <w:rPr>
+                <w:b w:val="0"/>
+                <w:i w:val="0"/>
+                <w:sz w:val="18"/>
+              </w:rPr>
+              <w:t>Blood count with smear, PT/INR, aPTT, fibrinogen: the FACTOR AND PLATELET screens.</w:t>
+            </w:r>
+          </w:p>
+        </w:tc>
+      </w:tr>
+      <w:tr>
+        <w:tc>
+          <w:tcPr>
+            <w:tcW w:type="dxa" w:w="5112"/>
+            <w:shd w:val="clear" w:color="auto" w:fill="F1EEEF"/>
+          </w:tcPr>
+          <w:p>
+            <w:pPr>
+              <w:spacing w:after="40"/>
+            </w:pPr>
+            <w:r>
+              <w:rPr>
+                <w:b/>
+                <w:sz w:val="18"/>
+              </w:rPr>
+            </w:r>
+            <w:r>
+              <w:rPr>
+                <w:b/>
+                <w:i w:val="0"/>
+                <w:sz w:val="18"/>
+              </w:rPr>
+              <w:t>Thrombotic workup</w:t>
+            </w:r>
+          </w:p>
+        </w:tc>
+        <w:tc>
+          <w:tcPr>
+            <w:tcW w:type="dxa" w:w="5112"/>
+          </w:tcPr>
+          <w:p>
+            <w:pPr>
+              <w:spacing w:after="40"/>
+            </w:pPr>
+            <w:r>
+              <w:rPr>
+                <w:sz w:val="18"/>
+              </w:rPr>
+            </w:r>
+            <w:r>
+              <w:rPr>
+                <w:b w:val="0"/>
+                <w:i w:val="0"/>
+                <w:sz w:val="18"/>
+              </w:rPr>
+              <w:t>PT, aPTT, D-DIMER (thrombin-generation markers); most abnormal in DIC. PT and D-dimer are independent risk factors for arterial thrombosis.</w:t>
+            </w:r>
+          </w:p>
+        </w:tc>
+      </w:tr>
+      <w:tr>
+        <w:tc>
+          <w:tcPr>
+            <w:tcW w:type="dxa" w:w="5112"/>
+            <w:shd w:val="clear" w:color="auto" w:fill="F1EEEF"/>
+          </w:tcPr>
+          <w:p>
+            <w:pPr>
+              <w:spacing w:after="40"/>
+            </w:pPr>
+            <w:r>
+              <w:rPr>
+                <w:b/>
+                <w:sz w:val="18"/>
+              </w:rPr>
+            </w:r>
+            <w:r>
+              <w:rPr>
+                <w:b/>
+                <w:i w:val="0"/>
+                <w:sz w:val="18"/>
+              </w:rPr>
+              <w:t>Hypercoagulable testing</w:t>
+            </w:r>
+          </w:p>
+        </w:tc>
+        <w:tc>
+          <w:tcPr>
+            <w:tcW w:type="dxa" w:w="5112"/>
+          </w:tcPr>
+          <w:p>
+            <w:pPr>
+              <w:spacing w:after="40"/>
+            </w:pPr>
+            <w:r>
+              <w:rPr>
+                <w:sz w:val="18"/>
+              </w:rPr>
+            </w:r>
+            <w:r>
+              <w:rPr>
+                <w:b w:val="0"/>
+                <w:i w:val="0"/>
+                <w:sz w:val="18"/>
+              </w:rPr>
+              <w:t>Primary causes: antithrombin III, protein C, protein S, factor XII; fibrinolytic mechanisms. Tests: anticoagulant factors (incl. LUPUS ANTICOAGULANT), fibrinogen, PT, aPTT, thrombin time.</w:t>
+            </w:r>
+          </w:p>
+        </w:tc>
+      </w:tr>
+      <w:tr>
+        <w:tc>
+          <w:tcPr>
+            <w:tcW w:type="dxa" w:w="5112"/>
+            <w:shd w:val="clear" w:color="auto" w:fill="F1EEEF"/>
+          </w:tcPr>
+          <w:p>
+            <w:pPr>
+              <w:spacing w:after="40"/>
+            </w:pPr>
+            <w:r>
+              <w:rPr>
+                <w:b/>
+                <w:sz w:val="18"/>
+              </w:rPr>
+            </w:r>
+            <w:r>
+              <w:rPr>
+                <w:b/>
+                <w:i w:val="0"/>
+                <w:sz w:val="18"/>
+              </w:rPr>
+              <w:t>Inherited bleeding, screens normal</w:t>
+            </w:r>
+          </w:p>
+        </w:tc>
+        <w:tc>
+          <w:tcPr>
+            <w:tcW w:type="dxa" w:w="5112"/>
+          </w:tcPr>
+          <w:p>
+            <w:pPr>
+              <w:spacing w:after="40"/>
+            </w:pPr>
+            <w:r>
+              <w:rPr>
+                <w:sz w:val="18"/>
+              </w:rPr>
+            </w:r>
+            <w:r>
+              <w:rPr>
+                <w:b w:val="0"/>
+                <w:i w:val="0"/>
+                <w:sz w:val="18"/>
+              </w:rPr>
+              <w:t>Skin bruising, petechiae, mucosal = platelet disorder or mild vWD · hemarthroses/deep hematoma = fibrinolytic inhibitor deficiency (euglobulin clot lysis time) · umbilical stump bleeding = FACTOR XIII.</w:t>
+            </w:r>
+          </w:p>
+        </w:tc>
+      </w:tr>
+      <w:tr>
+        <w:tc>
+          <w:tcPr>
+            <w:tcW w:type="dxa" w:w="5112"/>
+            <w:shd w:val="clear" w:color="auto" w:fill="F1EEEF"/>
+          </w:tcPr>
+          <w:p>
+            <w:pPr>
+              <w:spacing w:after="40"/>
+            </w:pPr>
+            <w:r>
+              <w:rPr>
+                <w:b/>
+                <w:sz w:val="18"/>
+              </w:rPr>
+            </w:r>
+            <w:r>
+              <w:rPr>
+                <w:b/>
+                <w:i w:val="0"/>
+                <w:sz w:val="18"/>
+              </w:rPr>
+              <w:t>Inherited bleeding, screens prolonged</w:t>
+            </w:r>
+          </w:p>
+        </w:tc>
+        <w:tc>
+          <w:tcPr>
+            <w:tcW w:type="dxa" w:w="5112"/>
+          </w:tcPr>
+          <w:p>
+            <w:pPr>
+              <w:spacing w:after="40"/>
+            </w:pPr>
+            <w:r>
+              <w:rPr>
+                <w:sz w:val="18"/>
+              </w:rPr>
+            </w:r>
+            <w:r>
+              <w:rPr>
+                <w:b w:val="0"/>
+                <w:i w:val="0"/>
+                <w:sz w:val="18"/>
+              </w:rPr>
+              <w:t>PT only = VII. aPTT only = VIII (hemophilia A), IX (hemophilia B), XI, severe von Willebrand disease. Both = X, V, II (normal thrombin time) or fibrinogen (prolonged thrombin time). Bleeding into joints and muscles = factor deficiency.</w:t>
+            </w:r>
+          </w:p>
+        </w:tc>
+      </w:tr>
+    </w:tbl>
+    <w:p>
+      <w:pPr>
+        <w:spacing w:after="80"/>
+      </w:pPr>
+    </w:p>
+    <w:p>
+      <w:pPr>
         <w:spacing w:after="120"/>
       </w:pPr>
       <w:r>
@@ -6366,7 +9724,7 @@
           <w:b w:val="0"/>
           <w:i w:val="0"/>
         </w:rPr>
-        <w:t xml:space="preserve"> Condensed from the Principles of Diagnostic Medicine I Exam 2 Study Guide (Class of 2028). Covers Lectures 7–9; Lecture 10 (Coagulation and Hemostasis Testing) is added when its deck is posted. Emphasis rows quote the 15, 17 and 21 September 2026 recordings; ★ = emphasized in the Lecture 9 recording. </w:t>
+        <w:t xml:space="preserve"> Condensed from the Principles of Diagnostic Medicine I Exam 2 Study Guide (Class of 2028). Covers Lectures 7–10. Emphasis rows quote the 15, 17, 21 and 30 September 2026 recordings; ★ = emphasized in a recording. </w:t>
       </w:r>
     </w:p>
     <w:sectPr>

</xml_diff>